<commit_message>
Close three source gaps; add retraction check and reference audit
- Ch. 1: expert-estimate dispersion now sourced (Karger et al., 2023).
- Ch. 3: replace an unsupported "declines in every category" sentence with
  what Gallup actually reports (Brenan, 2025), including the partisan gap.
- Ch. 9: cite affective-polarization and megastudy evidence for the
  civil-conflict claim, with the limits stated (Iyengar et al., 2019;
  Voelkel et al., 2024).
- Works Cited: four entries added (60 total, 60/60 matched); Appendices C, D
  and E updated to match.
- All DOIs checked for retractions and editorial notices on Crossref.
- Rebuild PDF (157 pp.), covers, EPUB and DOCX; update the KDP checklist,
  changelog and CLAUDE.md; add the 6 October pass report.

Co-Authored-By: Claude Sonnet 5.5 <noreply@anthropic.com>
Claude-Session: https://claude.ai/code/session_01JWAnyV9wtVuspHNbCAVQht
</commit_message>
<xml_diff>
--- a/book/output/LP_KDP-Trade_v1.0_Revised-Draft_2026-10-03.docx
+++ b/book/output/LP_KDP-Trade_v1.0_Revised-Draft_2026-10-03.docx
@@ -2034,7 +2034,7 @@
         <w:t xml:space="preserve"> </w:t>
       </w:r>
       <w:r>
-        <w:t xml:space="preserve">Nuclear war, engineered pandemics, catastrophic AI outcomes, grid collapse and civil conflict have no base rate, because they are not repeated trials. What exists instead is expert judgment, and on unprecedented events that judgment is widely dispersed. A dispersed estimate is not evidence for its high end. Quoting the highest credible figure as what</w:t>
+        <w:t xml:space="preserve">Nuclear war, engineered pandemics, catastrophic AI outcomes, grid collapse and civil conflict have no base rate, because they are not repeated trials. What exists instead is expert judgment, and on unprecedented events that judgment is widely dispersed. The Existential Risk Persuasion Tournament put the same questions to 80 domain experts and 89 superforecasters and shows how far apart two kinds of credible judgment can sit. The median probability of human extinction by 2100 was 6 percent for the experts and 1 percent for the superforecasters. For extinction caused by artificial intelligence it was 3 percent and 0.38 percent (Karger et al., 2023). The report’s own table of published estimates for AI-caused extinction runs from 25 percent down to 0.38 percent, a spread of about sixtyfold, although the studies differ in definitions and time horizons. A dispersed estimate is not evidence for its high end. Quoting the highest credible figure as what</w:t>
       </w:r>
       <w:r>
         <w:t xml:space="preserve"> </w:t>
@@ -5776,7 +5776,37 @@
         <w:t xml:space="preserve"> </w:t>
       </w:r>
       <w:r>
-        <w:t xml:space="preserve">Nation, party, progress, market and expert authority have each undergone serial and largely justified disillusionment within living memory. Long-running survey series on confidence in institutions show declines across nearly every category they track.</w:t>
+        <w:t xml:space="preserve">Nation, party, progress, market and expert authority have each undergone serial and largely justified disillusionment within living memory. Gallup’s nine institutions, tracked consistently since 1979, now average 28 percent confidence (</w:t>
+      </w:r>
+      <w:r>
+        <w:t xml:space="preserve">“</w:t>
+      </w:r>
+      <w:r>
+        <w:t xml:space="preserve">a great deal</w:t>
+      </w:r>
+      <w:r>
+        <w:t xml:space="preserve">”</w:t>
+      </w:r>
+      <w:r>
+        <w:t xml:space="preserve"> </w:t>
+      </w:r>
+      <w:r>
+        <w:t xml:space="preserve">or</w:t>
+      </w:r>
+      <w:r>
+        <w:t xml:space="preserve"> </w:t>
+      </w:r>
+      <w:r>
+        <w:t xml:space="preserve">“</w:t>
+      </w:r>
+      <w:r>
+        <w:t xml:space="preserve">quite a lot</w:t>
+      </w:r>
+      <w:r>
+        <w:t xml:space="preserve">”</w:t>
+      </w:r>
+      <w:r>
+        <w:t xml:space="preserve">). That is near the lowest reading in forty-six years of measurement, and the average has stayed under 30 percent for four years running (Brenan, 2025). The same report adds a qualification. The average is stable only in aggregate. Republicans’ and Democrats’ confidence swings with which party holds the presidency, and the 11-point gap between them is the largest in the series. Confidence is low overall, and for partisans it follows control of the White House.</w:t>
       </w:r>
     </w:p>
     <w:p>
@@ -12870,6 +12900,27 @@
         <w:t xml:space="preserve">Notice also where the leverage actually is. Chapter 1’s inventory showed that of all the civilization-scale threats a citizen is expected to have a view on, only two have nonzero individual leverage, and both are local. One is community-scale pandemic response. The other is civil conflict, the only threat on the list constituted by the aggregate ordinary conduct of ordinary people rather than by a government, a laboratory or a rock. So the conduct norms above are not a consolation prize awarded to a citizen who cannot reach the real threats. They are direct action on one of the two threats the citizen can actually reach. That is the load-bearing conclusion of this chapter, and the constructive half of the book stands or falls with it.</w:t>
       </w:r>
     </w:p>
+    <w:p>
+      <w:pPr>
+        <w:pStyle w:val="BodyText"/>
+      </w:pPr>
+      <w:r>
+        <w:t xml:space="preserve">The evidence for that conclusion is partial, and it is worth stating at its actual strength. The conduct that feeds civil conflict is, in the research literature, largely</w:t>
+      </w:r>
+      <w:r>
+        <w:t xml:space="preserve"> </w:t>
+      </w:r>
+      <w:r>
+        <w:rPr>
+          <w:iCs/>
+          <w:i/>
+        </w:rPr>
+        <w:t xml:space="preserve">affective polarization</w:t>
+      </w:r>
+      <w:r>
+        <w:t xml:space="preserve">: the growing dislike and distrust that ordinary Americans feel toward members of the other party (Iyengar et al., 2019). A megastudy of 32,059 Americans tested 25 treatments designed to reduce partisan animosity and antidemocratic attitudes. Many reduced animosity, most strongly those that showed participants relatable, sympathetic individuals on the other side or emphasized identities that rival partisans share. Several reduced support for undemocratic practices, most strongly by correcting misperceptions of the other side’s views (Voelkel et al., 2024). Those treatments resemble norms 1 and 7. The study measured attitudes in an experiment, and it tested treatments rather than norms. It supports the narrower claim that the attitudes behind civil conflict can be moved by the kind of act the norms ask for. It does not show that modeling a norm moves the aggregate.</w:t>
+      </w:r>
+    </w:p>
     <w:bookmarkStart w:id="143" w:name="why-now"/>
     <w:p>
       <w:pPr>
@@ -15160,7 +15211,7 @@
       </w:r>
     </w:p>
     <w:bookmarkEnd w:id="153"/>
-    <w:bookmarkStart w:id="184" w:name="works-cited"/>
+    <w:bookmarkStart w:id="188" w:name="works-cited"/>
     <w:p>
       <w:pPr>
         <w:pStyle w:val="Heading1"/>
@@ -15280,6 +15331,38 @@
         <w:pStyle w:val="BodyText"/>
       </w:pPr>
       <w:r>
+        <w:t xml:space="preserve">Brenan, M. (2025, July 17).</w:t>
+      </w:r>
+      <w:r>
+        <w:t xml:space="preserve"> </w:t>
+      </w:r>
+      <w:r>
+        <w:rPr>
+          <w:iCs/>
+          <w:i/>
+        </w:rPr>
+        <w:t xml:space="preserve">Democrats’ confidence in U.S. institutions sinks to new low</w:t>
+      </w:r>
+      <w:r>
+        <w:t xml:space="preserve">. Gallup.</w:t>
+      </w:r>
+      <w:r>
+        <w:t xml:space="preserve"> </w:t>
+      </w:r>
+      <w:hyperlink r:id="rId156">
+        <w:r>
+          <w:rPr>
+            <w:rStyle w:val="Hyperlink"/>
+          </w:rPr>
+          <w:t xml:space="preserve">https://news.gallup.com/poll/692633/democrats-confidence-institutions-sinks-new-low.aspx</w:t>
+        </w:r>
+      </w:hyperlink>
+    </w:p>
+    <w:p>
+      <w:pPr>
+        <w:pStyle w:val="BodyText"/>
+      </w:pPr>
+      <w:r>
         <w:t xml:space="preserve">Center for Near-Earth Object Studies. (2026).</w:t>
       </w:r>
       <w:r>
@@ -15314,7 +15397,7 @@
       <w:r>
         <w:t xml:space="preserve"> </w:t>
       </w:r>
-      <w:hyperlink r:id="rId156">
+      <w:hyperlink r:id="rId157">
         <w:r>
           <w:rPr>
             <w:rStyle w:val="Hyperlink"/>
@@ -15346,7 +15429,7 @@
       <w:r>
         <w:t xml:space="preserve"> </w:t>
       </w:r>
-      <w:hyperlink r:id="rId157">
+      <w:hyperlink r:id="rId158">
         <w:r>
           <w:rPr>
             <w:rStyle w:val="Hyperlink"/>
@@ -15378,7 +15461,7 @@
       <w:r>
         <w:t xml:space="preserve"> </w:t>
       </w:r>
-      <w:hyperlink r:id="rId158">
+      <w:hyperlink r:id="rId159">
         <w:r>
           <w:rPr>
             <w:rStyle w:val="Hyperlink"/>
@@ -15410,7 +15493,7 @@
       <w:r>
         <w:t xml:space="preserve"> </w:t>
       </w:r>
-      <w:hyperlink r:id="rId159">
+      <w:hyperlink r:id="rId160">
         <w:r>
           <w:rPr>
             <w:rStyle w:val="Hyperlink"/>
@@ -15442,7 +15525,7 @@
       <w:r>
         <w:t xml:space="preserve"> </w:t>
       </w:r>
-      <w:hyperlink r:id="rId160">
+      <w:hyperlink r:id="rId161">
         <w:r>
           <w:rPr>
             <w:rStyle w:val="Hyperlink"/>
@@ -15495,7 +15578,7 @@
       <w:r>
         <w:t xml:space="preserve"> </w:t>
       </w:r>
-      <w:hyperlink r:id="rId161">
+      <w:hyperlink r:id="rId162">
         <w:r>
           <w:rPr>
             <w:rStyle w:val="Hyperlink"/>
@@ -15656,7 +15739,7 @@
       <w:r>
         <w:t xml:space="preserve"> </w:t>
       </w:r>
-      <w:hyperlink r:id="rId162">
+      <w:hyperlink r:id="rId163">
         <w:r>
           <w:rPr>
             <w:rStyle w:val="Hyperlink"/>
@@ -15688,7 +15771,7 @@
       <w:r>
         <w:t xml:space="preserve"> </w:t>
       </w:r>
-      <w:hyperlink r:id="rId163">
+      <w:hyperlink r:id="rId164">
         <w:r>
           <w:rPr>
             <w:rStyle w:val="Hyperlink"/>
@@ -15720,7 +15803,7 @@
       <w:r>
         <w:t xml:space="preserve"> </w:t>
       </w:r>
-      <w:hyperlink r:id="rId164">
+      <w:hyperlink r:id="rId165">
         <w:r>
           <w:rPr>
             <w:rStyle w:val="Hyperlink"/>
@@ -15758,6 +15841,38 @@
         <w:pStyle w:val="BodyText"/>
       </w:pPr>
       <w:r>
+        <w:t xml:space="preserve">Iyengar, S., Lelkes, Y., Levendusky, M., Malhotra, N., &amp; Westwood, S. J. (2019). The origins and consequences of affective polarization in the United States.</w:t>
+      </w:r>
+      <w:r>
+        <w:t xml:space="preserve"> </w:t>
+      </w:r>
+      <w:r>
+        <w:rPr>
+          <w:iCs/>
+          <w:i/>
+        </w:rPr>
+        <w:t xml:space="preserve">Annual Review of Political Science, 22</w:t>
+      </w:r>
+      <w:r>
+        <w:t xml:space="preserve">, 129–146.</w:t>
+      </w:r>
+      <w:r>
+        <w:t xml:space="preserve"> </w:t>
+      </w:r>
+      <w:hyperlink r:id="rId166">
+        <w:r>
+          <w:rPr>
+            <w:rStyle w:val="Hyperlink"/>
+          </w:rPr>
+          <w:t xml:space="preserve">https://doi.org/10.1146/annurev-polisci-051117-073034</w:t>
+        </w:r>
+      </w:hyperlink>
+    </w:p>
+    <w:p>
+      <w:pPr>
+        <w:pStyle w:val="BodyText"/>
+      </w:pPr>
+      <w:r>
         <w:t xml:space="preserve">Jameton, A. (1984).</w:t>
       </w:r>
       <w:r>
@@ -15818,7 +15933,7 @@
       <w:r>
         <w:t xml:space="preserve"> </w:t>
       </w:r>
-      <w:hyperlink r:id="rId165">
+      <w:hyperlink r:id="rId167">
         <w:r>
           <w:rPr>
             <w:rStyle w:val="Hyperlink"/>
@@ -15928,6 +16043,41 @@
         <w:pStyle w:val="BodyText"/>
       </w:pPr>
       <w:r>
+        <w:t xml:space="preserve">Karger, E., Rosenberg, J., Jacobs, Z., Hickman, M., Hadshar, R., Gamin, K., Smith, T., Williams, B., McCaslin, T., Thomas, S., &amp; Tetlock, P. E. (2023).</w:t>
+      </w:r>
+      <w:r>
+        <w:t xml:space="preserve"> </w:t>
+      </w:r>
+      <w:r>
+        <w:rPr>
+          <w:iCs/>
+          <w:i/>
+        </w:rPr>
+        <w:t xml:space="preserve">Forecasting existential risks: Evidence from a long-run forecasting tournament</w:t>
+      </w:r>
+      <w:r>
+        <w:t xml:space="preserve"> </w:t>
+      </w:r>
+      <w:r>
+        <w:t xml:space="preserve">(Forecasting Research Institute report, revised August 8, 2023).</w:t>
+      </w:r>
+      <w:r>
+        <w:t xml:space="preserve"> </w:t>
+      </w:r>
+      <w:hyperlink r:id="rId168">
+        <w:r>
+          <w:rPr>
+            <w:rStyle w:val="Hyperlink"/>
+          </w:rPr>
+          <w:t xml:space="preserve">https://forecastingresearch.org/research/existential-risk-persuasion-tournament</w:t>
+        </w:r>
+      </w:hyperlink>
+    </w:p>
+    <w:p>
+      <w:pPr>
+        <w:pStyle w:val="BodyText"/>
+      </w:pPr>
+      <w:r>
         <w:t xml:space="preserve">Kaufmann, W. (1974).</w:t>
       </w:r>
       <w:r>
@@ -15970,7 +16120,7 @@
       <w:r>
         <w:t xml:space="preserve"> </w:t>
       </w:r>
-      <w:hyperlink r:id="rId166">
+      <w:hyperlink r:id="rId169">
         <w:r>
           <w:rPr>
             <w:rStyle w:val="Hyperlink"/>
@@ -16002,7 +16152,7 @@
       <w:r>
         <w:t xml:space="preserve"> </w:t>
       </w:r>
-      <w:hyperlink r:id="rId167">
+      <w:hyperlink r:id="rId170">
         <w:r>
           <w:rPr>
             <w:rStyle w:val="Hyperlink"/>
@@ -16058,7 +16208,7 @@
       <w:r>
         <w:t xml:space="preserve"> </w:t>
       </w:r>
-      <w:hyperlink r:id="rId168">
+      <w:hyperlink r:id="rId171">
         <w:r>
           <w:rPr>
             <w:rStyle w:val="Hyperlink"/>
@@ -16111,7 +16261,7 @@
       <w:r>
         <w:t xml:space="preserve"> </w:t>
       </w:r>
-      <w:hyperlink r:id="rId169">
+      <w:hyperlink r:id="rId172">
         <w:r>
           <w:rPr>
             <w:rStyle w:val="Hyperlink"/>
@@ -16143,7 +16293,7 @@
       <w:r>
         <w:t xml:space="preserve"> </w:t>
       </w:r>
-      <w:hyperlink r:id="rId170">
+      <w:hyperlink r:id="rId173">
         <w:r>
           <w:rPr>
             <w:rStyle w:val="Hyperlink"/>
@@ -16202,7 +16352,7 @@
       <w:r>
         <w:t xml:space="preserve"> </w:t>
       </w:r>
-      <w:hyperlink r:id="rId171">
+      <w:hyperlink r:id="rId174">
         <w:r>
           <w:rPr>
             <w:rStyle w:val="Hyperlink"/>
@@ -16243,7 +16393,7 @@
       <w:r>
         <w:t xml:space="preserve"> </w:t>
       </w:r>
-      <w:hyperlink r:id="rId172">
+      <w:hyperlink r:id="rId175">
         <w:r>
           <w:rPr>
             <w:rStyle w:val="Hyperlink"/>
@@ -16284,7 +16434,7 @@
       <w:r>
         <w:t xml:space="preserve"> </w:t>
       </w:r>
-      <w:hyperlink r:id="rId173">
+      <w:hyperlink r:id="rId176">
         <w:r>
           <w:rPr>
             <w:rStyle w:val="Hyperlink"/>
@@ -16325,7 +16475,7 @@
       <w:r>
         <w:t xml:space="preserve"> </w:t>
       </w:r>
-      <w:hyperlink r:id="rId174">
+      <w:hyperlink r:id="rId177">
         <w:r>
           <w:rPr>
             <w:rStyle w:val="Hyperlink"/>
@@ -16366,7 +16516,7 @@
       <w:r>
         <w:t xml:space="preserve"> </w:t>
       </w:r>
-      <w:hyperlink r:id="rId175">
+      <w:hyperlink r:id="rId178">
         <w:r>
           <w:rPr>
             <w:rStyle w:val="Hyperlink"/>
@@ -16404,7 +16554,7 @@
       <w:r>
         <w:t xml:space="preserve"> </w:t>
       </w:r>
-      <w:hyperlink r:id="rId176">
+      <w:hyperlink r:id="rId179">
         <w:r>
           <w:rPr>
             <w:rStyle w:val="Hyperlink"/>
@@ -16460,7 +16610,7 @@
       <w:r>
         <w:t xml:space="preserve"> </w:t>
       </w:r>
-      <w:hyperlink r:id="rId177">
+      <w:hyperlink r:id="rId180">
         <w:r>
           <w:rPr>
             <w:rStyle w:val="Hyperlink"/>
@@ -16492,7 +16642,7 @@
       <w:r>
         <w:t xml:space="preserve"> </w:t>
       </w:r>
-      <w:hyperlink r:id="rId178">
+      <w:hyperlink r:id="rId181">
         <w:r>
           <w:rPr>
             <w:rStyle w:val="Hyperlink"/>
@@ -16539,7 +16689,7 @@
       <w:r>
         <w:t xml:space="preserve"> </w:t>
       </w:r>
-      <w:hyperlink r:id="rId179">
+      <w:hyperlink r:id="rId182">
         <w:r>
           <w:rPr>
             <w:rStyle w:val="Hyperlink"/>
@@ -16571,7 +16721,7 @@
       <w:r>
         <w:t xml:space="preserve"> </w:t>
       </w:r>
-      <w:hyperlink r:id="rId180">
+      <w:hyperlink r:id="rId183">
         <w:r>
           <w:rPr>
             <w:rStyle w:val="Hyperlink"/>
@@ -16606,7 +16756,7 @@
       <w:r>
         <w:t xml:space="preserve"> </w:t>
       </w:r>
-      <w:hyperlink r:id="rId181">
+      <w:hyperlink r:id="rId184">
         <w:r>
           <w:rPr>
             <w:rStyle w:val="Hyperlink"/>
@@ -16626,6 +16776,38 @@
         <w:pStyle w:val="BodyText"/>
       </w:pPr>
       <w:r>
+        <w:t xml:space="preserve">Voelkel, J. G., Stagnaro, M. N., Chu, J. Y., Pink, S. L., Mernyk, J. S., Redekopp, C., Ghezae, I., Cashman, M., Adjodah, D., Allen, L. G., Allis, L. V., Baleria, G., Ballantyne, N., Van Bavel, J. J., Blunden, H., Braley, A., Bryan, C. J., Celniker, J. B., Cikara, M., . . . Willer, R. (2024). Megastudy testing 25 treatments to reduce antidemocratic attitudes and partisan animosity.</w:t>
+      </w:r>
+      <w:r>
+        <w:t xml:space="preserve"> </w:t>
+      </w:r>
+      <w:r>
+        <w:rPr>
+          <w:iCs/>
+          <w:i/>
+        </w:rPr>
+        <w:t xml:space="preserve">Science, 386</w:t>
+      </w:r>
+      <w:r>
+        <w:t xml:space="preserve">(6719), Article eadh4764.</w:t>
+      </w:r>
+      <w:r>
+        <w:t xml:space="preserve"> </w:t>
+      </w:r>
+      <w:hyperlink r:id="rId185">
+        <w:r>
+          <w:rPr>
+            <w:rStyle w:val="Hyperlink"/>
+          </w:rPr>
+          <w:t xml:space="preserve">https://doi.org/10.1126/science.adh4764</w:t>
+        </w:r>
+      </w:hyperlink>
+    </w:p>
+    <w:p>
+      <w:pPr>
+        <w:pStyle w:val="BodyText"/>
+      </w:pPr>
+      <w:r>
         <w:t xml:space="preserve">Wallace, D. F. (1993). E unibus pluram: Television and U.S. fiction.</w:t>
       </w:r>
       <w:r>
@@ -16749,7 +16931,7 @@
       <w:r>
         <w:t xml:space="preserve"> </w:t>
       </w:r>
-      <w:hyperlink r:id="rId182">
+      <w:hyperlink r:id="rId186">
         <w:r>
           <w:rPr>
             <w:rStyle w:val="Hyperlink"/>
@@ -16802,7 +16984,7 @@
       <w:r>
         <w:t xml:space="preserve"> </w:t>
       </w:r>
-      <w:hyperlink r:id="rId183">
+      <w:hyperlink r:id="rId187">
         <w:r>
           <w:rPr>
             <w:rStyle w:val="Hyperlink"/>
@@ -16811,8 +16993,8 @@
         </w:r>
       </w:hyperlink>
     </w:p>
-    <w:bookmarkEnd w:id="184"/>
-    <w:bookmarkStart w:id="185" w:name="app-a"/>
+    <w:bookmarkEnd w:id="188"/>
+    <w:bookmarkStart w:id="189" w:name="app-a"/>
     <w:p>
       <w:pPr>
         <w:pStyle w:val="Heading1"/>
@@ -17332,8 +17514,8 @@
         <w:t xml:space="preserve">principle to Samuel Johnson, a claim this edition could not support. Neither claim appears in the book.</w:t>
       </w:r>
     </w:p>
-    <w:bookmarkEnd w:id="185"/>
-    <w:bookmarkStart w:id="186" w:name="app-b"/>
+    <w:bookmarkEnd w:id="189"/>
+    <w:bookmarkStart w:id="190" w:name="app-b"/>
     <w:p>
       <w:pPr>
         <w:pStyle w:val="Heading1"/>
@@ -18367,8 +18549,8 @@
         </w:tc>
       </w:tr>
     </w:tbl>
-    <w:bookmarkEnd w:id="186"/>
-    <w:bookmarkStart w:id="187" w:name="app-c"/>
+    <w:bookmarkEnd w:id="190"/>
+    <w:bookmarkStart w:id="191" w:name="app-c"/>
     <w:p>
       <w:pPr>
         <w:pStyle w:val="Heading1"/>
@@ -18767,7 +18949,7 @@
               <w:jc w:val="left"/>
             </w:pPr>
             <w:r>
-              <w:t xml:space="preserve">Fact about the estimates; source to be added (see Appendix E)</w:t>
+              <w:t xml:space="preserve">Karger et al. (2023): extinction by 2100, 6% (experts) vs 1% (superforecasters); estimates differ in definitions and horizons</w:t>
             </w:r>
           </w:p>
         </w:tc>
@@ -19093,7 +19275,7 @@
               <w:jc w:val="left"/>
             </w:pPr>
             <w:r>
-              <w:t xml:space="preserve">Declining confidence in institutions</w:t>
+              <w:t xml:space="preserve">Low confidence in institutions</w:t>
             </w:r>
           </w:p>
         </w:tc>
@@ -19117,7 +19299,25 @@
               <w:jc w:val="left"/>
             </w:pPr>
             <w:r>
-              <w:t xml:space="preserve">Long-running survey series; source to be added</w:t>
+              <w:t xml:space="preserve">Brenan (2025): 28% average, near the 46-year low; partisan gap is the series maximum.</w:t>
+            </w:r>
+            <w:r>
+              <w:t xml:space="preserve"> </w:t>
+            </w:r>
+            <w:r>
+              <w:t xml:space="preserve">“</w:t>
+            </w:r>
+            <w:r>
+              <w:t xml:space="preserve">Declines in nearly every category</w:t>
+            </w:r>
+            <w:r>
+              <w:t xml:space="preserve">”</w:t>
+            </w:r>
+            <w:r>
+              <w:t xml:space="preserve"> </w:t>
+            </w:r>
+            <w:r>
+              <w:t xml:space="preserve">is no longer claimed</w:t>
             </w:r>
           </w:p>
         </w:tc>
@@ -19861,6 +20061,124 @@
               <w:jc w:val="left"/>
             </w:pPr>
             <w:r>
+              <w:t xml:space="preserve">Treatments reduce partisan animosity and antidemocratic attitudes</w:t>
+            </w:r>
+          </w:p>
+        </w:tc>
+        <w:tc>
+          <w:tcPr/>
+          <w:p>
+            <w:pPr>
+              <w:pStyle w:val="Compact"/>
+              <w:jc w:val="left"/>
+            </w:pPr>
+            <w:r>
+              <w:t xml:space="preserve">Supported</w:t>
+            </w:r>
+          </w:p>
+        </w:tc>
+        <w:tc>
+          <w:tcPr/>
+          <w:p>
+            <w:pPr>
+              <w:pStyle w:val="Compact"/>
+              <w:jc w:val="left"/>
+            </w:pPr>
+            <w:r>
+              <w:t xml:space="preserve">Voelkel et al. (2024), a 32,059-person experiment; attitudes, not long-run conduct; persistence not assessed here</w:t>
+            </w:r>
+          </w:p>
+        </w:tc>
+        <w:tc>
+          <w:tcPr/>
+          <w:p>
+            <w:pPr>
+              <w:pStyle w:val="Compact"/>
+              <w:jc w:val="center"/>
+            </w:pPr>
+            <w:r>
+              <w:t xml:space="preserve">9</w:t>
+            </w:r>
+          </w:p>
+        </w:tc>
+      </w:tr>
+      <w:tr>
+        <w:tc>
+          <w:tcPr/>
+          <w:p>
+            <w:pPr>
+              <w:pStyle w:val="Compact"/>
+              <w:jc w:val="left"/>
+            </w:pPr>
+            <w:r>
+              <w:t xml:space="preserve">Affective polarization as the form civil conflict takes</w:t>
+            </w:r>
+          </w:p>
+        </w:tc>
+        <w:tc>
+          <w:tcPr/>
+          <w:p>
+            <w:pPr>
+              <w:pStyle w:val="Compact"/>
+              <w:jc w:val="left"/>
+            </w:pPr>
+            <w:r>
+              <w:t xml:space="preserve">Supported</w:t>
+            </w:r>
+          </w:p>
+        </w:tc>
+        <w:tc>
+          <w:tcPr/>
+          <w:p>
+            <w:pPr>
+              <w:pStyle w:val="Compact"/>
+              <w:jc w:val="left"/>
+            </w:pPr>
+            <w:r>
+              <w:t xml:space="preserve">Iyengar et al. (2019), review; the identification with the book’s</w:t>
+            </w:r>
+            <w:r>
+              <w:t xml:space="preserve"> </w:t>
+            </w:r>
+            <w:r>
+              <w:t xml:space="preserve">“</w:t>
+            </w:r>
+            <w:r>
+              <w:t xml:space="preserve">civil conflict</w:t>
+            </w:r>
+            <w:r>
+              <w:t xml:space="preserve">”</w:t>
+            </w:r>
+            <w:r>
+              <w:t xml:space="preserve"> </w:t>
+            </w:r>
+            <w:r>
+              <w:t xml:space="preserve">is interpretive</w:t>
+            </w:r>
+          </w:p>
+        </w:tc>
+        <w:tc>
+          <w:tcPr/>
+          <w:p>
+            <w:pPr>
+              <w:pStyle w:val="Compact"/>
+              <w:jc w:val="center"/>
+            </w:pPr>
+            <w:r>
+              <w:t xml:space="preserve">9</w:t>
+            </w:r>
+          </w:p>
+        </w:tc>
+      </w:tr>
+      <w:tr>
+        <w:tc>
+          <w:tcPr/>
+          <w:p>
+            <w:pPr>
+              <w:pStyle w:val="Compact"/>
+              <w:jc w:val="left"/>
+            </w:pPr>
+            <w:r>
               <w:t xml:space="preserve">Ego depletion</w:t>
             </w:r>
           </w:p>
@@ -19903,8 +20221,8 @@
         </w:tc>
       </w:tr>
     </w:tbl>
-    <w:bookmarkEnd w:id="187"/>
-    <w:bookmarkStart w:id="190" w:name="app-d"/>
+    <w:bookmarkEnd w:id="191"/>
+    <w:bookmarkStart w:id="194" w:name="app-d"/>
     <w:p>
       <w:pPr>
         <w:pStyle w:val="Heading1"/>
@@ -19913,7 +20231,7 @@
         <w:t xml:space="preserve">Appendix D: Limits of the Argument, and the Tests That Would Show It Wrong</w:t>
       </w:r>
     </w:p>
-    <w:bookmarkStart w:id="188" w:name="standing-limits"/>
+    <w:bookmarkStart w:id="192" w:name="standing-limits"/>
     <w:p>
       <w:pPr>
         <w:pStyle w:val="Heading2"/>
@@ -20027,11 +20345,11 @@
         <w:t xml:space="preserve"> </w:t>
       </w:r>
       <w:r>
-        <w:t xml:space="preserve">(an interested arranger, and friction removed for each individual) may do less work than the argument needs. Proposition 8 couples components that each have evidence, but the coupling itself is inferred. The norm-seeding argument of Chapter 9 depends on a historical record of norm entrepreneurship whose successes may be selected on the outcome.</w:t>
-      </w:r>
-    </w:p>
-    <w:bookmarkEnd w:id="188"/>
-    <w:bookmarkStart w:id="189" w:name="tests-by-proposition"/>
+        <w:t xml:space="preserve">(an interested arranger, and friction removed for each individual) may do less work than the argument needs. Proposition 8 couples components that each have evidence, but the coupling itself is inferred. The norm-seeding argument of Chapter 9 depends on a historical record of norm entrepreneurship whose successes may be selected on the outcome. The claim that civil conflict is the one threat within a citizen’s reach rests on attitude experiments (Voelkel et al., 2024), not on long-run data about conduct.</w:t>
+      </w:r>
+    </w:p>
+    <w:bookmarkEnd w:id="192"/>
+    <w:bookmarkStart w:id="193" w:name="tests-by-proposition"/>
     <w:p>
       <w:pPr>
         <w:pStyle w:val="Heading2"/>
@@ -20660,9 +20978,9 @@
         <w:t xml:space="preserve">to unpack it into a decision. The proposition predicts near-universal failure, including among professional critics.</w:t>
       </w:r>
     </w:p>
-    <w:bookmarkEnd w:id="189"/>
-    <w:bookmarkEnd w:id="190"/>
-    <w:bookmarkStart w:id="196" w:name="app-e"/>
+    <w:bookmarkEnd w:id="193"/>
+    <w:bookmarkEnd w:id="194"/>
+    <w:bookmarkStart w:id="200" w:name="app-e"/>
     <w:p>
       <w:pPr>
         <w:pStyle w:val="Heading1"/>
@@ -20671,7 +20989,7 @@
         <w:t xml:space="preserve">Appendix E: Note on Quotation and Sources</w:t>
       </w:r>
     </w:p>
-    <w:bookmarkStart w:id="191" w:name="the-marks"/>
+    <w:bookmarkStart w:id="195" w:name="the-marks"/>
     <w:p>
       <w:pPr>
         <w:pStyle w:val="Heading2"/>
@@ -20764,8 +21082,8 @@
         <w:t xml:space="preserve">to Paul V. Cohn. The title page of the transcribed edition gives Thomas Common as translator, with Cohn and Maude Petre rendering the poetry. The Works Cited follows the title page. The constitutional phrases in Chapter 2 are from the Bill of Rights. The modular edition’s edition-of-record decision (Cambridge Texts for Nietzsche) still governs paraphrase. Public-domain translations are used for verbatim quotation because they could be verified and they raise no permissions question for a self-published book.</w:t>
       </w:r>
     </w:p>
-    <w:bookmarkEnd w:id="191"/>
-    <w:bookmarkStart w:id="192" w:name="unverified-items"/>
+    <w:bookmarkEnd w:id="195"/>
+    <w:bookmarkStart w:id="196" w:name="unverified-items"/>
     <w:p>
       <w:pPr>
         <w:pStyle w:val="Heading2"/>
@@ -20991,8 +21309,8 @@
         <w:t xml:space="preserve">page location.</w:t>
       </w:r>
     </w:p>
-    <w:bookmarkEnd w:id="192"/>
-    <w:bookmarkStart w:id="193" w:name="paraphrases-awaiting-verbatim-wording"/>
+    <w:bookmarkEnd w:id="196"/>
+    <w:bookmarkStart w:id="197" w:name="paraphrases-awaiting-verbatim-wording"/>
     <w:p>
       <w:pPr>
         <w:pStyle w:val="Heading2"/>
@@ -21192,8 +21510,8 @@
         <w:t xml:space="preserve">page reference.</w:t>
       </w:r>
     </w:p>
-    <w:bookmarkEnd w:id="193"/>
-    <w:bookmarkStart w:id="194" w:name="a-quotation-that-does-not-exist"/>
+    <w:bookmarkEnd w:id="197"/>
+    <w:bookmarkStart w:id="198" w:name="a-quotation-that-does-not-exist"/>
     <w:p>
       <w:pPr>
         <w:pStyle w:val="Heading2"/>
@@ -21241,8 +21559,8 @@
         <w:t xml:space="preserve">. Its circulating instances (on quotation sites, in blog posts and in a widely shared remark by a popular psychologist) trace back only to secondary and tertiary sources. The nearest genuine passage is CW 9i ¶472, on the trickster, which differs in figure, in kind of relation and in its emphasis on unconsciousness. Chapter 8 tells the story because it is an availability cascade in miniature, and because quietly substituting a better quotation would have hidden a demonstration of the book’s own thesis. Do not use the aphorism.</w:t>
       </w:r>
     </w:p>
-    <w:bookmarkEnd w:id="194"/>
-    <w:bookmarkStart w:id="195" w:name="X0c983f42a99c567fc1ab72c4504e0a07b0b42af"/>
+    <w:bookmarkEnd w:id="198"/>
+    <w:bookmarkStart w:id="199" w:name="X0c983f42a99c567fc1ab72c4504e0a07b0b42af"/>
     <w:p>
       <w:pPr>
         <w:pStyle w:val="Heading2"/>
@@ -21284,7 +21602,7 @@
         <w:pStyle w:val="Compact"/>
       </w:pPr>
       <w:r>
-        <w:t xml:space="preserve">A source for the dispersion of expert estimates on unprecedented catastrophic risks (Chapter 1).</w:t>
+        <w:t xml:space="preserve">Confirmation of the 1998 congressional goal and its completion (Chapter 1).</w:t>
       </w:r>
     </w:p>
     <w:p>
@@ -21296,30 +21614,6 @@
         <w:pStyle w:val="Compact"/>
       </w:pPr>
       <w:r>
-        <w:t xml:space="preserve">A source for long-run declines in confidence in institutions (Chapter 3), such as the Gallup or General Social Survey series.</w:t>
-      </w:r>
-    </w:p>
-    <w:p>
-      <w:pPr>
-        <w:numPr>
-          <w:ilvl w:val="0"/>
-          <w:numId w:val="1009"/>
-        </w:numPr>
-        <w:pStyle w:val="Compact"/>
-      </w:pPr>
-      <w:r>
-        <w:t xml:space="preserve">Confirmation of the 1998 congressional goal and its completion (Chapter 1).</w:t>
-      </w:r>
-    </w:p>
-    <w:p>
-      <w:pPr>
-        <w:numPr>
-          <w:ilvl w:val="0"/>
-          <w:numId w:val="1009"/>
-        </w:numPr>
-        <w:pStyle w:val="Compact"/>
-      </w:pPr>
-      <w:r>
         <w:t xml:space="preserve">Confirmation of the original publication year (1909) of Common’s</w:t>
       </w:r>
       <w:r>
@@ -21339,8 +21633,8 @@
         <w:t xml:space="preserve">in the Levy edition.</w:t>
       </w:r>
     </w:p>
-    <w:bookmarkEnd w:id="195"/>
-    <w:bookmarkEnd w:id="196"/>
+    <w:bookmarkEnd w:id="199"/>
+    <w:bookmarkEnd w:id="200"/>
     <w:sectPr/>
   </w:body>
 </w:document>

</xml_diff>

<commit_message>
Adversarial pass: strengthen three weak points, record the rest
- Ch. 7: add one measured case for "assent has changed almost nothing"
  (Pew, 2024, teens online almost constantly, 24% a decade earlier).
- Ch. 3: separate the part of the Gallup pattern the lion diagnosis
  explains (independents, level at 25%) from the part it does not
  (partisan swings, assigned to group loyalty).
- Ch. 6: credit Popper (1945/1966) and Whitson and Galinsky (2008) as the
  nearest existing constructs for Proposition 5.
- Works Cited: three entries added (67, all matched); Appendices C, D and
  E updated.
- Add the adversarial-pass notes: four questions, four aporias, the
  critic-in-corpus decision for the author, falsification conditions.
- Rebuild PDF (161 pp.), covers, EPUB and DOCX; log the changes and the
  skill/ruling conflict.

Co-Authored-By: Claude Sonnet 5.5 <noreply@anthropic.com>
Claude-Session: https://claude.ai/code/session_01JWAnyV9wtVuspHNbCAVQht
</commit_message>
<xml_diff>
--- a/book/output/LP_KDP-Trade_v1.0_Revised-Draft_2026-10-03.docx
+++ b/book/output/LP_KDP-Trade_v1.0_Revised-Draft_2026-10-03.docx
@@ -5842,7 +5842,7 @@
         <w:t xml:space="preserve">”</w:t>
       </w:r>
       <w:r>
-        <w:t xml:space="preserve">). That is near the lowest reading in forty-six years of measurement, and the average has stayed under 30 percent for four years running (Brenan, 2025). The same report adds a qualification. The average is stable only in aggregate. Republicans’ and Democrats’ confidence swings with which party holds the presidency, and the 11-point gap between them is the largest in the series. Confidence is low overall, and for partisans it follows control of the White House.</w:t>
+        <w:t xml:space="preserve">). That is near the lowest reading in forty-six years of measurement, and the average has stayed under 30 percent for four years running (Brenan, 2025). The same report adds a qualification. The average is stable only in aggregate. Republicans’ and Democrats’ confidence swings with which party holds the presidency, and the 11-point gap between them is the largest in the series. Confidence is low overall, and for partisans it follows control of the White House. Independents are the informative exception. Their average, 25 percent, has stayed statistically level for three years whoever holds the White House, a standing refusal of the kind the lion diagnosis predicts. The partisans’ swings fit it less well. They look more like loyalty to the party in power, the group narcissism of Chapter 4, which is a different mechanism that this diagnosis does not explain.</w:t>
       </w:r>
     </w:p>
     <w:p>
@@ -8750,6 +8750,14 @@
         <w:t xml:space="preserve">Every entry on the right answers the corresponding lack on the left. A random error does not look like that. A solution does.</w:t>
       </w:r>
     </w:p>
+    <w:p>
+      <w:pPr>
+        <w:pStyle w:val="BodyText"/>
+      </w:pPr>
+      <w:r>
+        <w:t xml:space="preserve">The idea has near relatives, and they should be named. Popper (1945/1966) argued that the conspiracy theory of society is what remains when belief in divine agency is secularized: the gods are abandoned and sinister groups take their place. Experiments show that people who lack control are more likely to perceive patterns that are not there, including conspiracies (Whitson &amp; Galinsky, 2008). The proposal here shares their premise that a loss of control invites an invented agent or pattern. It differs by tying the invention to one kind of authority, the anonymous kind, and by saying where theories should and should not cluster, which exposes it to the tests at the end of the chapter.</w:t>
+      </w:r>
+    </w:p>
     <w:bookmarkEnd w:id="99"/>
     <w:bookmarkStart w:id="103" w:name="three-things-the-account-explains"/>
     <w:p>
@@ -10064,7 +10072,7 @@
         <w:pStyle w:val="BodyText"/>
       </w:pPr>
       <w:r>
-        <w:t xml:space="preserve">Near-universal assent was achieved within about fifteen years, on a set of propositions about the shape of ordinary life. On its face that is an extraordinary success for a critical literature. Then look for the change. Aggregate consumption has not fallen. Institutional trust has not recovered. The mechanisms described have not been altered by being described. Whatever has changed in fifteen years, it has not changed in the direction the critique argues for.</w:t>
+        <w:t xml:space="preserve">Near-universal assent was achieved within about fifteen years, on a set of propositions about the shape of ordinary life. On its face that is an extraordinary success for a critical literature. Then look for the change. Aggregate consumption has not fallen. Institutional trust has not recovered. The mechanisms described have not been altered by being described. Whatever has changed in fifteen years, it has not changed in the direction the critique argues for. The best-measured case is the one the critique is most anxious about. Pew’s 2024 survey of American teenagers, which its authors frame as arriving amid national concern about technology’s effect on young people, found that nearly half say they are online almost constantly, up from 24 percent a decade earlier (Faverio &amp; Sidoti, 2024). The concern was public and loud, and the behavior it targeted rose.</w:t>
       </w:r>
     </w:p>
     <w:p>
@@ -15648,7 +15656,7 @@
       </w:r>
     </w:p>
     <w:bookmarkEnd w:id="155"/>
-    <w:bookmarkStart w:id="194" w:name="works-cited"/>
+    <w:bookmarkStart w:id="196" w:name="works-cited"/>
     <w:p>
       <w:pPr>
         <w:pStyle w:val="Heading1"/>
@@ -16008,6 +16016,38 @@
         <w:pStyle w:val="BodyText"/>
       </w:pPr>
       <w:r>
+        <w:t xml:space="preserve">Faverio, M., &amp; Sidoti, O. (2024, December 12).</w:t>
+      </w:r>
+      <w:r>
+        <w:t xml:space="preserve"> </w:t>
+      </w:r>
+      <w:r>
+        <w:rPr>
+          <w:iCs/>
+          <w:i/>
+        </w:rPr>
+        <w:t xml:space="preserve">Teens, social media and technology 2024</w:t>
+      </w:r>
+      <w:r>
+        <w:t xml:space="preserve">. Pew Research Center.</w:t>
+      </w:r>
+      <w:r>
+        <w:t xml:space="preserve"> </w:t>
+      </w:r>
+      <w:hyperlink r:id="rId165">
+        <w:r>
+          <w:rPr>
+            <w:rStyle w:val="Hyperlink"/>
+          </w:rPr>
+          <w:t xml:space="preserve">https://www.pewresearch.org/internet/2024/12/12/teens-social-media-and-technology-2024/</w:t>
+        </w:r>
+      </w:hyperlink>
+    </w:p>
+    <w:p>
+      <w:pPr>
+        <w:pStyle w:val="BodyText"/>
+      </w:pPr>
+      <w:r>
         <w:t xml:space="preserve">Festinger, L. (1957).</w:t>
       </w:r>
       <w:r>
@@ -16047,7 +16087,7 @@
       <w:r>
         <w:t xml:space="preserve"> </w:t>
       </w:r>
-      <w:hyperlink r:id="rId165">
+      <w:hyperlink r:id="rId166">
         <w:r>
           <w:rPr>
             <w:rStyle w:val="Hyperlink"/>
@@ -16208,7 +16248,7 @@
       <w:r>
         <w:t xml:space="preserve"> </w:t>
       </w:r>
-      <w:hyperlink r:id="rId166">
+      <w:hyperlink r:id="rId167">
         <w:r>
           <w:rPr>
             <w:rStyle w:val="Hyperlink"/>
@@ -16240,7 +16280,7 @@
       <w:r>
         <w:t xml:space="preserve"> </w:t>
       </w:r>
-      <w:hyperlink r:id="rId167">
+      <w:hyperlink r:id="rId168">
         <w:r>
           <w:rPr>
             <w:rStyle w:val="Hyperlink"/>
@@ -16272,7 +16312,7 @@
       <w:r>
         <w:t xml:space="preserve"> </w:t>
       </w:r>
-      <w:hyperlink r:id="rId168">
+      <w:hyperlink r:id="rId169">
         <w:r>
           <w:rPr>
             <w:rStyle w:val="Hyperlink"/>
@@ -16328,7 +16368,7 @@
       <w:r>
         <w:t xml:space="preserve"> </w:t>
       </w:r>
-      <w:hyperlink r:id="rId169">
+      <w:hyperlink r:id="rId170">
         <w:r>
           <w:rPr>
             <w:rStyle w:val="Hyperlink"/>
@@ -16360,7 +16400,7 @@
       <w:r>
         <w:t xml:space="preserve"> </w:t>
       </w:r>
-      <w:hyperlink r:id="rId170">
+      <w:hyperlink r:id="rId171">
         <w:r>
           <w:rPr>
             <w:rStyle w:val="Hyperlink"/>
@@ -16434,7 +16474,7 @@
       <w:r>
         <w:t xml:space="preserve"> </w:t>
       </w:r>
-      <w:hyperlink r:id="rId171">
+      <w:hyperlink r:id="rId172">
         <w:r>
           <w:rPr>
             <w:rStyle w:val="Hyperlink"/>
@@ -16562,7 +16602,7 @@
       <w:r>
         <w:t xml:space="preserve"> </w:t>
       </w:r>
-      <w:hyperlink r:id="rId172">
+      <w:hyperlink r:id="rId173">
         <w:r>
           <w:rPr>
             <w:rStyle w:val="Hyperlink"/>
@@ -16597,7 +16637,7 @@
       <w:r>
         <w:t xml:space="preserve"> </w:t>
       </w:r>
-      <w:hyperlink r:id="rId173">
+      <w:hyperlink r:id="rId174">
         <w:r>
           <w:rPr>
             <w:rStyle w:val="Hyperlink"/>
@@ -16653,7 +16693,7 @@
       <w:r>
         <w:t xml:space="preserve"> </w:t>
       </w:r>
-      <w:hyperlink r:id="rId174">
+      <w:hyperlink r:id="rId175">
         <w:r>
           <w:rPr>
             <w:rStyle w:val="Hyperlink"/>
@@ -16685,7 +16725,7 @@
       <w:r>
         <w:t xml:space="preserve"> </w:t>
       </w:r>
-      <w:hyperlink r:id="rId175">
+      <w:hyperlink r:id="rId176">
         <w:r>
           <w:rPr>
             <w:rStyle w:val="Hyperlink"/>
@@ -16741,7 +16781,7 @@
       <w:r>
         <w:t xml:space="preserve"> </w:t>
       </w:r>
-      <w:hyperlink r:id="rId176">
+      <w:hyperlink r:id="rId177">
         <w:r>
           <w:rPr>
             <w:rStyle w:val="Hyperlink"/>
@@ -16794,7 +16834,7 @@
       <w:r>
         <w:t xml:space="preserve"> </w:t>
       </w:r>
-      <w:hyperlink r:id="rId177">
+      <w:hyperlink r:id="rId178">
         <w:r>
           <w:rPr>
             <w:rStyle w:val="Hyperlink"/>
@@ -16826,7 +16866,7 @@
       <w:r>
         <w:t xml:space="preserve"> </w:t>
       </w:r>
-      <w:hyperlink r:id="rId178">
+      <w:hyperlink r:id="rId179">
         <w:r>
           <w:rPr>
             <w:rStyle w:val="Hyperlink"/>
@@ -16885,7 +16925,7 @@
       <w:r>
         <w:t xml:space="preserve"> </w:t>
       </w:r>
-      <w:hyperlink r:id="rId179">
+      <w:hyperlink r:id="rId180">
         <w:r>
           <w:rPr>
             <w:rStyle w:val="Hyperlink"/>
@@ -16926,7 +16966,7 @@
       <w:r>
         <w:t xml:space="preserve"> </w:t>
       </w:r>
-      <w:hyperlink r:id="rId180">
+      <w:hyperlink r:id="rId181">
         <w:r>
           <w:rPr>
             <w:rStyle w:val="Hyperlink"/>
@@ -16967,7 +17007,7 @@
       <w:r>
         <w:t xml:space="preserve"> </w:t>
       </w:r>
-      <w:hyperlink r:id="rId181">
+      <w:hyperlink r:id="rId182">
         <w:r>
           <w:rPr>
             <w:rStyle w:val="Hyperlink"/>
@@ -17008,7 +17048,7 @@
       <w:r>
         <w:t xml:space="preserve"> </w:t>
       </w:r>
-      <w:hyperlink r:id="rId182">
+      <w:hyperlink r:id="rId183">
         <w:r>
           <w:rPr>
             <w:rStyle w:val="Hyperlink"/>
@@ -17049,7 +17089,7 @@
       <w:r>
         <w:t xml:space="preserve"> </w:t>
       </w:r>
-      <w:hyperlink r:id="rId183">
+      <w:hyperlink r:id="rId184">
         <w:r>
           <w:rPr>
             <w:rStyle w:val="Hyperlink"/>
@@ -17087,7 +17127,7 @@
       <w:r>
         <w:t xml:space="preserve"> </w:t>
       </w:r>
-      <w:hyperlink r:id="rId184">
+      <w:hyperlink r:id="rId185">
         <w:r>
           <w:rPr>
             <w:rStyle w:val="Hyperlink"/>
@@ -17101,6 +17141,30 @@
         <w:pStyle w:val="BodyText"/>
       </w:pPr>
       <w:r>
+        <w:t xml:space="preserve">Popper, K. R. (1966).</w:t>
+      </w:r>
+      <w:r>
+        <w:t xml:space="preserve"> </w:t>
+      </w:r>
+      <w:r>
+        <w:rPr>
+          <w:iCs/>
+          <w:i/>
+        </w:rPr>
+        <w:t xml:space="preserve">The open society and its enemies: Vol. 2. The high tide of prophecy: Hegel, Marx, and the aftermath</w:t>
+      </w:r>
+      <w:r>
+        <w:t xml:space="preserve"> </w:t>
+      </w:r>
+      <w:r>
+        <w:t xml:space="preserve">(5th ed., rev.). Routledge &amp; Kegan Paul. (Original work published 1945)</w:t>
+      </w:r>
+    </w:p>
+    <w:p>
+      <w:pPr>
+        <w:pStyle w:val="BodyText"/>
+      </w:pPr>
+      <w:r>
         <w:t xml:space="preserve">Rousseau, J.-J. (1992).</w:t>
       </w:r>
       <w:r>
@@ -17143,7 +17207,7 @@
       <w:r>
         <w:t xml:space="preserve"> </w:t>
       </w:r>
-      <w:hyperlink r:id="rId185">
+      <w:hyperlink r:id="rId186">
         <w:r>
           <w:rPr>
             <w:rStyle w:val="Hyperlink"/>
@@ -17175,7 +17239,7 @@
       <w:r>
         <w:t xml:space="preserve"> </w:t>
       </w:r>
-      <w:hyperlink r:id="rId186">
+      <w:hyperlink r:id="rId187">
         <w:r>
           <w:rPr>
             <w:rStyle w:val="Hyperlink"/>
@@ -17222,7 +17286,7 @@
       <w:r>
         <w:t xml:space="preserve"> </w:t>
       </w:r>
-      <w:hyperlink r:id="rId187">
+      <w:hyperlink r:id="rId188">
         <w:r>
           <w:rPr>
             <w:rStyle w:val="Hyperlink"/>
@@ -17254,7 +17318,7 @@
       <w:r>
         <w:t xml:space="preserve"> </w:t>
       </w:r>
-      <w:hyperlink r:id="rId188">
+      <w:hyperlink r:id="rId189">
         <w:r>
           <w:rPr>
             <w:rStyle w:val="Hyperlink"/>
@@ -17289,7 +17353,7 @@
       <w:r>
         <w:t xml:space="preserve"> </w:t>
       </w:r>
-      <w:hyperlink r:id="rId189">
+      <w:hyperlink r:id="rId190">
         <w:r>
           <w:rPr>
             <w:rStyle w:val="Hyperlink"/>
@@ -17327,7 +17391,7 @@
       <w:r>
         <w:t xml:space="preserve"> </w:t>
       </w:r>
-      <w:hyperlink r:id="rId190">
+      <w:hyperlink r:id="rId191">
         <w:r>
           <w:rPr>
             <w:rStyle w:val="Hyperlink"/>
@@ -17464,7 +17528,7 @@
       <w:r>
         <w:t xml:space="preserve"> </w:t>
       </w:r>
-      <w:hyperlink r:id="rId191">
+      <w:hyperlink r:id="rId192">
         <w:r>
           <w:rPr>
             <w:rStyle w:val="Hyperlink"/>
@@ -17517,7 +17581,7 @@
       <w:r>
         <w:t xml:space="preserve"> </w:t>
       </w:r>
-      <w:hyperlink r:id="rId192">
+      <w:hyperlink r:id="rId193">
         <w:r>
           <w:rPr>
             <w:rStyle w:val="Hyperlink"/>
@@ -17531,6 +17595,38 @@
         <w:pStyle w:val="BodyText"/>
       </w:pPr>
       <w:r>
+        <w:t xml:space="preserve">Whitson, J. A., &amp; Galinsky, A. D. (2008). Lacking control increases illusory pattern perception.</w:t>
+      </w:r>
+      <w:r>
+        <w:t xml:space="preserve"> </w:t>
+      </w:r>
+      <w:r>
+        <w:rPr>
+          <w:iCs/>
+          <w:i/>
+        </w:rPr>
+        <w:t xml:space="preserve">Science, 322</w:t>
+      </w:r>
+      <w:r>
+        <w:t xml:space="preserve">(5898), 115–117.</w:t>
+      </w:r>
+      <w:r>
+        <w:t xml:space="preserve"> </w:t>
+      </w:r>
+      <w:hyperlink r:id="rId194">
+        <w:r>
+          <w:rPr>
+            <w:rStyle w:val="Hyperlink"/>
+          </w:rPr>
+          <w:t xml:space="preserve">https://doi.org/10.1126/science.1159845</w:t>
+        </w:r>
+      </w:hyperlink>
+    </w:p>
+    <w:p>
+      <w:pPr>
+        <w:pStyle w:val="BodyText"/>
+      </w:pPr>
+      <w:r>
         <w:t xml:space="preserve">Wilson, T. D., Reinhard, D. A., Westgate, E. C., Gilbert, D. T., Ellerbeck, N., Hahn, C., Brown, C. L., &amp; Shaked, A. (2014). Just think: The challenges of the disengaged mind.</w:t>
       </w:r>
       <w:r>
@@ -17549,7 +17645,7 @@
       <w:r>
         <w:t xml:space="preserve"> </w:t>
       </w:r>
-      <w:hyperlink r:id="rId193">
+      <w:hyperlink r:id="rId195">
         <w:r>
           <w:rPr>
             <w:rStyle w:val="Hyperlink"/>
@@ -17558,8 +17654,8 @@
         </w:r>
       </w:hyperlink>
     </w:p>
-    <w:bookmarkEnd w:id="194"/>
-    <w:bookmarkStart w:id="195" w:name="app-a"/>
+    <w:bookmarkEnd w:id="196"/>
+    <w:bookmarkStart w:id="197" w:name="app-a"/>
     <w:p>
       <w:pPr>
         <w:pStyle w:val="Heading1"/>
@@ -18079,8 +18175,8 @@
         <w:t xml:space="preserve">principle to Samuel Johnson, a claim this edition could not support. Neither claim appears in the book.</w:t>
       </w:r>
     </w:p>
-    <w:bookmarkEnd w:id="195"/>
-    <w:bookmarkStart w:id="196" w:name="app-b"/>
+    <w:bookmarkEnd w:id="197"/>
+    <w:bookmarkStart w:id="198" w:name="app-b"/>
     <w:p>
       <w:pPr>
         <w:pStyle w:val="Heading1"/>
@@ -19114,8 +19210,8 @@
         </w:tc>
       </w:tr>
     </w:tbl>
-    <w:bookmarkEnd w:id="196"/>
-    <w:bookmarkStart w:id="197" w:name="app-c"/>
+    <w:bookmarkEnd w:id="198"/>
+    <w:bookmarkStart w:id="199" w:name="app-c"/>
     <w:p>
       <w:pPr>
         <w:pStyle w:val="Heading1"/>
@@ -20376,7 +20472,7 @@
               <w:jc w:val="left"/>
             </w:pPr>
             <w:r>
-              <w:t xml:space="preserve">Intentional binding as agency measure</w:t>
+              <w:t xml:space="preserve">Teen use of social media rose while public concern was high</w:t>
             </w:r>
           </w:p>
         </w:tc>
@@ -20388,7 +20484,7 @@
               <w:jc w:val="left"/>
             </w:pPr>
             <w:r>
-              <w:t xml:space="preserve">Contested</w:t>
+              <w:t xml:space="preserve">Supported</w:t>
             </w:r>
           </w:p>
         </w:tc>
@@ -20400,7 +20496,25 @@
               <w:jc w:val="left"/>
             </w:pPr>
             <w:r>
-              <w:t xml:space="preserve">Corroborative only</w:t>
+              <w:t xml:space="preserve">Faverio and Sidoti (2024): probability panel of 1,391 US teens, self-reported;</w:t>
+            </w:r>
+            <w:r>
+              <w:t xml:space="preserve"> </w:t>
+            </w:r>
+            <w:r>
+              <w:t xml:space="preserve">‘</w:t>
+            </w:r>
+            <w:r>
+              <w:t xml:space="preserve">almost constantly online</w:t>
+            </w:r>
+            <w:r>
+              <w:t xml:space="preserve">’</w:t>
+            </w:r>
+            <w:r>
+              <w:t xml:space="preserve"> </w:t>
+            </w:r>
+            <w:r>
+              <w:t xml:space="preserve">24% a decade earlier vs nearly half in 2024. Says nothing about adults, or about the level of assent among teens</w:t>
             </w:r>
           </w:p>
         </w:tc>
@@ -20412,7 +20526,7 @@
               <w:jc w:val="center"/>
             </w:pPr>
             <w:r>
-              <w:t xml:space="preserve">5</w:t>
+              <w:t xml:space="preserve">7</w:t>
             </w:r>
           </w:p>
         </w:tc>
@@ -20426,7 +20540,7 @@
               <w:jc w:val="left"/>
             </w:pPr>
             <w:r>
-              <w:t xml:space="preserve">Libet readiness potential as prior decision</w:t>
+              <w:t xml:space="preserve">Intentional binding as agency measure</w:t>
             </w:r>
           </w:p>
         </w:tc>
@@ -20450,7 +20564,7 @@
               <w:jc w:val="left"/>
             </w:pPr>
             <w:r>
-              <w:t xml:space="preserve">Popular reading superseded; nothing rests on it</w:t>
+              <w:t xml:space="preserve">Corroborative only</w:t>
             </w:r>
           </w:p>
         </w:tc>
@@ -20476,7 +20590,7 @@
               <w:jc w:val="left"/>
             </w:pPr>
             <w:r>
-              <w:t xml:space="preserve">Conspiracy motives not satisfied by belief</w:t>
+              <w:t xml:space="preserve">Libet readiness potential as prior decision</w:t>
             </w:r>
           </w:p>
         </w:tc>
@@ -20488,7 +20602,7 @@
               <w:jc w:val="left"/>
             </w:pPr>
             <w:r>
-              <w:t xml:space="preserve">Supported</w:t>
+              <w:t xml:space="preserve">Contested</w:t>
             </w:r>
           </w:p>
         </w:tc>
@@ -20500,7 +20614,7 @@
               <w:jc w:val="left"/>
             </w:pPr>
             <w:r>
-              <w:t xml:space="preserve">Direction well supported; effect sizes uncertain</w:t>
+              <w:t xml:space="preserve">Popular reading superseded; nothing rests on it</w:t>
             </w:r>
           </w:p>
         </w:tc>
@@ -20512,7 +20626,7 @@
               <w:jc w:val="center"/>
             </w:pPr>
             <w:r>
-              <w:t xml:space="preserve">6</w:t>
+              <w:t xml:space="preserve">5</w:t>
             </w:r>
           </w:p>
         </w:tc>
@@ -20526,7 +20640,7 @@
               <w:jc w:val="left"/>
             </w:pPr>
             <w:r>
-              <w:t xml:space="preserve">Form-constancy across contents</w:t>
+              <w:t xml:space="preserve">Lacking control increases illusory pattern perception, including perceiving conspiracies</w:t>
             </w:r>
           </w:p>
         </w:tc>
@@ -20538,7 +20652,7 @@
               <w:jc w:val="left"/>
             </w:pPr>
             <w:r>
-              <w:t xml:space="preserve">Supported by observation</w:t>
+              <w:t xml:space="preserve">Supported</w:t>
             </w:r>
           </w:p>
         </w:tc>
@@ -20550,7 +20664,7 @@
               <w:jc w:val="left"/>
             </w:pPr>
             <w:r>
-              <w:t xml:space="preserve">Copying not excluded; selection argument untested</w:t>
+              <w:t xml:space="preserve">Whitson and Galinsky (2008): six experiments; supports the motive, not the book’s specific claim about anonymous authority</w:t>
             </w:r>
           </w:p>
         </w:tc>
@@ -20576,7 +20690,7 @@
               <w:jc w:val="left"/>
             </w:pPr>
             <w:r>
-              <w:t xml:space="preserve">Cynical genius illusion and calibration</w:t>
+              <w:t xml:space="preserve">Conspiracy motives not satisfied by belief</w:t>
             </w:r>
           </w:p>
         </w:tc>
@@ -20600,7 +20714,7 @@
               <w:jc w:val="left"/>
             </w:pPr>
             <w:r>
-              <w:t xml:space="preserve">Large multinational data</w:t>
+              <w:t xml:space="preserve">Direction well supported; effect sizes uncertain</w:t>
             </w:r>
           </w:p>
         </w:tc>
@@ -20612,7 +20726,7 @@
               <w:jc w:val="center"/>
             </w:pPr>
             <w:r>
-              <w:t xml:space="preserve">9</w:t>
+              <w:t xml:space="preserve">6</w:t>
             </w:r>
           </w:p>
         </w:tc>
@@ -20626,7 +20740,7 @@
               <w:jc w:val="left"/>
             </w:pPr>
             <w:r>
-              <w:t xml:space="preserve">Treatments reduce partisan animosity and antidemocratic attitudes</w:t>
+              <w:t xml:space="preserve">Form-constancy across contents</w:t>
             </w:r>
           </w:p>
         </w:tc>
@@ -20638,7 +20752,7 @@
               <w:jc w:val="left"/>
             </w:pPr>
             <w:r>
-              <w:t xml:space="preserve">Supported</w:t>
+              <w:t xml:space="preserve">Supported by observation</w:t>
             </w:r>
           </w:p>
         </w:tc>
@@ -20650,7 +20764,7 @@
               <w:jc w:val="left"/>
             </w:pPr>
             <w:r>
-              <w:t xml:space="preserve">Voelkel et al. (2024), a 32,059-person experiment; attitudes, not long-run conduct; persistence not assessed here</w:t>
+              <w:t xml:space="preserve">Copying not excluded; selection argument untested</w:t>
             </w:r>
           </w:p>
         </w:tc>
@@ -20662,7 +20776,7 @@
               <w:jc w:val="center"/>
             </w:pPr>
             <w:r>
-              <w:t xml:space="preserve">9</w:t>
+              <w:t xml:space="preserve">6</w:t>
             </w:r>
           </w:p>
         </w:tc>
@@ -20676,7 +20790,7 @@
               <w:jc w:val="left"/>
             </w:pPr>
             <w:r>
-              <w:t xml:space="preserve">Affective polarization as the form civil conflict takes</w:t>
+              <w:t xml:space="preserve">Cynical genius illusion and calibration</w:t>
             </w:r>
           </w:p>
         </w:tc>
@@ -20700,25 +20814,7 @@
               <w:jc w:val="left"/>
             </w:pPr>
             <w:r>
-              <w:t xml:space="preserve">Iyengar et al. (2019), review; the identification with the book’s</w:t>
-            </w:r>
-            <w:r>
-              <w:t xml:space="preserve"> </w:t>
-            </w:r>
-            <w:r>
-              <w:t xml:space="preserve">“</w:t>
-            </w:r>
-            <w:r>
-              <w:t xml:space="preserve">civil conflict</w:t>
-            </w:r>
-            <w:r>
-              <w:t xml:space="preserve">”</w:t>
-            </w:r>
-            <w:r>
-              <w:t xml:space="preserve"> </w:t>
-            </w:r>
-            <w:r>
-              <w:t xml:space="preserve">is interpretive</w:t>
+              <w:t xml:space="preserve">Large multinational data</w:t>
             </w:r>
           </w:p>
         </w:tc>
@@ -20744,7 +20840,7 @@
               <w:jc w:val="left"/>
             </w:pPr>
             <w:r>
-              <w:t xml:space="preserve">Distress tolerance as a higher-order construct with frustration tolerance as a dimension</w:t>
+              <w:t xml:space="preserve">Treatments reduce partisan animosity and antidemocratic attitudes</w:t>
             </w:r>
           </w:p>
         </w:tc>
@@ -20756,7 +20852,7 @@
               <w:jc w:val="left"/>
             </w:pPr>
             <w:r>
-              <w:t xml:space="preserve">Contested</w:t>
+              <w:t xml:space="preserve">Supported</w:t>
             </w:r>
           </w:p>
         </w:tc>
@@ -20768,7 +20864,7 @@
               <w:jc w:val="left"/>
             </w:pPr>
             <w:r>
-              <w:t xml:space="preserve">Wesner et al. (2023); structure debated; behavioral and self-report indicators did not form one dimension (Hsu et al., 2023)</w:t>
+              <w:t xml:space="preserve">Voelkel et al. (2024), a 32,059-person experiment; attitudes, not long-run conduct; persistence not assessed here</w:t>
             </w:r>
           </w:p>
         </w:tc>
@@ -20780,7 +20876,7 @@
               <w:jc w:val="center"/>
             </w:pPr>
             <w:r>
-              <w:t xml:space="preserve">8</w:t>
+              <w:t xml:space="preserve">9</w:t>
             </w:r>
           </w:p>
         </w:tc>
@@ -20794,7 +20890,7 @@
               <w:jc w:val="left"/>
             </w:pPr>
             <w:r>
-              <w:t xml:space="preserve">Struggle before instruction aids understanding and transfer</w:t>
+              <w:t xml:space="preserve">Affective polarization as the form civil conflict takes</w:t>
             </w:r>
           </w:p>
         </w:tc>
@@ -20818,7 +20914,25 @@
               <w:jc w:val="left"/>
             </w:pPr>
             <w:r>
-              <w:t xml:space="preserve">Kapur (2015); Darabi et al. (2018): moderately positive, from twelve experimental studies; effect depends on a consolidation phase</w:t>
+              <w:t xml:space="preserve">Iyengar et al. (2019), review; the identification with the book’s</w:t>
+            </w:r>
+            <w:r>
+              <w:t xml:space="preserve"> </w:t>
+            </w:r>
+            <w:r>
+              <w:t xml:space="preserve">“</w:t>
+            </w:r>
+            <w:r>
+              <w:t xml:space="preserve">civil conflict</w:t>
+            </w:r>
+            <w:r>
+              <w:t xml:space="preserve">”</w:t>
+            </w:r>
+            <w:r>
+              <w:t xml:space="preserve"> </w:t>
+            </w:r>
+            <w:r>
+              <w:t xml:space="preserve">is interpretive</w:t>
             </w:r>
           </w:p>
         </w:tc>
@@ -20830,7 +20944,7 @@
               <w:jc w:val="center"/>
             </w:pPr>
             <w:r>
-              <w:t xml:space="preserve">8</w:t>
+              <w:t xml:space="preserve">9</w:t>
             </w:r>
           </w:p>
         </w:tc>
@@ -20844,6 +20958,106 @@
               <w:jc w:val="left"/>
             </w:pPr>
             <w:r>
+              <w:t xml:space="preserve">Distress tolerance as a higher-order construct with frustration tolerance as a dimension</w:t>
+            </w:r>
+          </w:p>
+        </w:tc>
+        <w:tc>
+          <w:tcPr/>
+          <w:p>
+            <w:pPr>
+              <w:pStyle w:val="Compact"/>
+              <w:jc w:val="left"/>
+            </w:pPr>
+            <w:r>
+              <w:t xml:space="preserve">Contested</w:t>
+            </w:r>
+          </w:p>
+        </w:tc>
+        <w:tc>
+          <w:tcPr/>
+          <w:p>
+            <w:pPr>
+              <w:pStyle w:val="Compact"/>
+              <w:jc w:val="left"/>
+            </w:pPr>
+            <w:r>
+              <w:t xml:space="preserve">Wesner et al. (2023); structure debated; behavioral and self-report indicators did not form one dimension (Hsu et al., 2023)</w:t>
+            </w:r>
+          </w:p>
+        </w:tc>
+        <w:tc>
+          <w:tcPr/>
+          <w:p>
+            <w:pPr>
+              <w:pStyle w:val="Compact"/>
+              <w:jc w:val="center"/>
+            </w:pPr>
+            <w:r>
+              <w:t xml:space="preserve">8</w:t>
+            </w:r>
+          </w:p>
+        </w:tc>
+      </w:tr>
+      <w:tr>
+        <w:tc>
+          <w:tcPr/>
+          <w:p>
+            <w:pPr>
+              <w:pStyle w:val="Compact"/>
+              <w:jc w:val="left"/>
+            </w:pPr>
+            <w:r>
+              <w:t xml:space="preserve">Struggle before instruction aids understanding and transfer</w:t>
+            </w:r>
+          </w:p>
+        </w:tc>
+        <w:tc>
+          <w:tcPr/>
+          <w:p>
+            <w:pPr>
+              <w:pStyle w:val="Compact"/>
+              <w:jc w:val="left"/>
+            </w:pPr>
+            <w:r>
+              <w:t xml:space="preserve">Supported</w:t>
+            </w:r>
+          </w:p>
+        </w:tc>
+        <w:tc>
+          <w:tcPr/>
+          <w:p>
+            <w:pPr>
+              <w:pStyle w:val="Compact"/>
+              <w:jc w:val="left"/>
+            </w:pPr>
+            <w:r>
+              <w:t xml:space="preserve">Kapur (2015); Darabi et al. (2018): moderately positive, from twelve experimental studies; effect depends on a consolidation phase</w:t>
+            </w:r>
+          </w:p>
+        </w:tc>
+        <w:tc>
+          <w:tcPr/>
+          <w:p>
+            <w:pPr>
+              <w:pStyle w:val="Compact"/>
+              <w:jc w:val="center"/>
+            </w:pPr>
+            <w:r>
+              <w:t xml:space="preserve">8</w:t>
+            </w:r>
+          </w:p>
+        </w:tc>
+      </w:tr>
+      <w:tr>
+        <w:tc>
+          <w:tcPr/>
+          <w:p>
+            <w:pPr>
+              <w:pStyle w:val="Compact"/>
+              <w:jc w:val="left"/>
+            </w:pPr>
+            <w:r>
               <w:t xml:space="preserve">Ego depletion</w:t>
             </w:r>
           </w:p>
@@ -20886,8 +21100,8 @@
         </w:tc>
       </w:tr>
     </w:tbl>
-    <w:bookmarkEnd w:id="197"/>
-    <w:bookmarkStart w:id="200" w:name="app-d"/>
+    <w:bookmarkEnd w:id="199"/>
+    <w:bookmarkStart w:id="202" w:name="app-d"/>
     <w:p>
       <w:pPr>
         <w:pStyle w:val="Heading1"/>
@@ -20896,7 +21110,7 @@
         <w:t xml:space="preserve">Appendix D: Limits of the Argument, and the Tests That Would Show It Wrong</w:t>
       </w:r>
     </w:p>
-    <w:bookmarkStart w:id="198" w:name="standing-limits"/>
+    <w:bookmarkStart w:id="200" w:name="standing-limits"/>
     <w:p>
       <w:pPr>
         <w:pStyle w:val="Heading2"/>
@@ -21010,11 +21224,11 @@
         <w:t xml:space="preserve"> </w:t>
       </w:r>
       <w:r>
-        <w:t xml:space="preserve">(an interested arranger, and friction removed for each individual) may do less work than the argument needs. Proposition 8 couples components that each have evidence, but the coupling itself is inferred. Proposition 10 claims a shared ingredient and a common family of capacities; the research on distress tolerance supports the family and leaves open whether practice transfers between its members. The norm-seeding argument of Chapter 9 depends on a historical record of norm entrepreneurship whose successes may be selected on the outcome. The claim that civil conflict is the one threat within a citizen’s reach rests on attitude experiments (Voelkel et al., 2024), not on long-run data about conduct.</w:t>
-      </w:r>
-    </w:p>
-    <w:bookmarkEnd w:id="198"/>
-    <w:bookmarkStart w:id="199" w:name="tests-by-proposition"/>
+        <w:t xml:space="preserve">(an interested arranger, and friction removed for each individual) may do less work than the argument needs. Proposition 8 couples components that each have evidence, but the coupling itself is inferred. Proposition 10 claims a shared ingredient and a common family of capacities; the research on distress tolerance supports the family and leaves open whether practice transfers between its members. The norm-seeding argument of Chapter 9 depends on a historical record of norm entrepreneurship whose successes may be selected on the outcome. The claim that civil conflict is the one threat within a citizen’s reach rests on attitude experiments (Voelkel et al., 2024), not on long-run data about conduct. The datum of Chapter 7, that near-universal assent has changed almost nothing, rests on one measured case (teen self-reports in Faverio and Sidoti, 2024) and on assent among adults that is observed informally and not measured here.</w:t>
+      </w:r>
+    </w:p>
+    <w:bookmarkEnd w:id="200"/>
+    <w:bookmarkStart w:id="201" w:name="tests-by-proposition"/>
     <w:p>
       <w:pPr>
         <w:pStyle w:val="Heading2"/>
@@ -21661,9 +21875,9 @@
         <w:t xml:space="preserve">to unpack it into a decision. The proposition predicts near-universal failure, including among professional critics.</w:t>
       </w:r>
     </w:p>
-    <w:bookmarkEnd w:id="199"/>
-    <w:bookmarkEnd w:id="200"/>
-    <w:bookmarkStart w:id="206" w:name="app-e"/>
+    <w:bookmarkEnd w:id="201"/>
+    <w:bookmarkEnd w:id="202"/>
+    <w:bookmarkStart w:id="208" w:name="app-e"/>
     <w:p>
       <w:pPr>
         <w:pStyle w:val="Heading1"/>
@@ -21672,7 +21886,7 @@
         <w:t xml:space="preserve">Appendix E: Note on Quotation and Sources</w:t>
       </w:r>
     </w:p>
-    <w:bookmarkStart w:id="201" w:name="the-marks"/>
+    <w:bookmarkStart w:id="203" w:name="the-marks"/>
     <w:p>
       <w:pPr>
         <w:pStyle w:val="Heading2"/>
@@ -21765,8 +21979,8 @@
         <w:t xml:space="preserve">to Paul V. Cohn. The title page of the transcribed edition gives Thomas Common as translator, with Cohn and Maude Petre rendering the poetry. The Works Cited follows the title page. The constitutional phrases in Chapter 2 are from the Bill of Rights. The modular edition’s edition-of-record decision (Cambridge Texts for Nietzsche) still governs paraphrase. Public-domain translations are used for verbatim quotation because they could be verified and they raise no permissions question for a self-published book.</w:t>
       </w:r>
     </w:p>
-    <w:bookmarkEnd w:id="201"/>
-    <w:bookmarkStart w:id="202" w:name="unverified-items"/>
+    <w:bookmarkEnd w:id="203"/>
+    <w:bookmarkStart w:id="204" w:name="unverified-items"/>
     <w:p>
       <w:pPr>
         <w:pStyle w:val="Heading2"/>
@@ -22048,8 +22262,8 @@
         <w:t xml:space="preserve">a NASA or Congressional primary document.</w:t>
       </w:r>
     </w:p>
-    <w:bookmarkEnd w:id="202"/>
-    <w:bookmarkStart w:id="203" w:name="paraphrases-awaiting-verbatim-wording"/>
+    <w:bookmarkEnd w:id="204"/>
+    <w:bookmarkStart w:id="205" w:name="paraphrases-awaiting-verbatim-wording"/>
     <w:p>
       <w:pPr>
         <w:pStyle w:val="Heading2"/>
@@ -22094,14 +22308,36 @@
         <w:pStyle w:val="Compact"/>
       </w:pPr>
       <w:r>
-        <w:rPr>
-          <w:iCs/>
-          <w:i/>
-        </w:rPr>
-        <w:t xml:space="preserve">The Gay Science</w:t>
-      </w:r>
-      <w:r>
-        <w:t xml:space="preserve">, Nauckhoff translation, §357 (Chapter 3).</w:t>
+        <w:t xml:space="preserve">Popper,</w:t>
+      </w:r>
+      <w:r>
+        <w:t xml:space="preserve"> </w:t>
+      </w:r>
+      <w:r>
+        <w:rPr>
+          <w:iCs/>
+          <w:i/>
+        </w:rPr>
+        <w:t xml:space="preserve">The Open Society and Its Enemies</w:t>
+      </w:r>
+      <w:r>
+        <w:t xml:space="preserve">, Vol. 2 (Chapter 6). The paraphrase of his conspiracy-theory-of-society passage needs a page locator and, ideally, verbatim wording.</w:t>
+      </w:r>
+      <w:r>
+        <w:t xml:space="preserve"> </w:t>
+      </w:r>
+      <w:r>
+        <w:rPr>
+          <w:iCs/>
+          <w:i/>
+        </w:rPr>
+        <w:t xml:space="preserve">Needed:</w:t>
+      </w:r>
+      <w:r>
+        <w:t xml:space="preserve"> </w:t>
+      </w:r>
+      <w:r>
+        <w:t xml:space="preserve">the printed page.</w:t>
       </w:r>
     </w:p>
     <w:p>
@@ -22113,20 +22349,14 @@
         <w:pStyle w:val="Compact"/>
       </w:pPr>
       <w:r>
-        <w:t xml:space="preserve">Tocqueville,</w:t>
-      </w:r>
-      <w:r>
-        <w:t xml:space="preserve"> </w:t>
-      </w:r>
-      <w:r>
-        <w:rPr>
-          <w:iCs/>
-          <w:i/>
-        </w:rPr>
-        <w:t xml:space="preserve">Democracy in America</w:t>
-      </w:r>
-      <w:r>
-        <w:t xml:space="preserve">, Vol. 2, Book 4, Ch. 6 (Introduction, Chapter 2). This is a deliberate paraphrase of the Reeve translation.</w:t>
+        <w:rPr>
+          <w:iCs/>
+          <w:i/>
+        </w:rPr>
+        <w:t xml:space="preserve">The Gay Science</w:t>
+      </w:r>
+      <w:r>
+        <w:t xml:space="preserve">, Nauckhoff translation, §357 (Chapter 3).</w:t>
       </w:r>
     </w:p>
     <w:p>
@@ -22138,36 +22368,20 @@
         <w:pStyle w:val="Compact"/>
       </w:pPr>
       <w:r>
-        <w:t xml:space="preserve">Watts,</w:t>
-      </w:r>
-      <w:r>
-        <w:t xml:space="preserve"> </w:t>
-      </w:r>
-      <w:r>
-        <w:rPr>
-          <w:iCs/>
-          <w:i/>
-        </w:rPr>
-        <w:t xml:space="preserve">The Wisdom of Insecurity</w:t>
-      </w:r>
-      <w:r>
-        <w:t xml:space="preserve">: the law of reversed effort and the security paradox (Chapter 9).</w:t>
-      </w:r>
-      <w:r>
-        <w:t xml:space="preserve"> </w:t>
-      </w:r>
-      <w:r>
-        <w:rPr>
-          <w:iCs/>
-          <w:i/>
-        </w:rPr>
-        <w:t xml:space="preserve">Needed:</w:t>
-      </w:r>
-      <w:r>
-        <w:t xml:space="preserve"> </w:t>
-      </w:r>
-      <w:r>
-        <w:t xml:space="preserve">page numbers.</w:t>
+        <w:t xml:space="preserve">Tocqueville,</w:t>
+      </w:r>
+      <w:r>
+        <w:t xml:space="preserve"> </w:t>
+      </w:r>
+      <w:r>
+        <w:rPr>
+          <w:iCs/>
+          <w:i/>
+        </w:rPr>
+        <w:t xml:space="preserve">Democracy in America</w:t>
+      </w:r>
+      <w:r>
+        <w:t xml:space="preserve">, Vol. 2, Book 4, Ch. 6 (Introduction, Chapter 2). This is a deliberate paraphrase of the Reeve translation.</w:t>
       </w:r>
     </w:p>
     <w:p>
@@ -22179,14 +22393,20 @@
         <w:pStyle w:val="Compact"/>
       </w:pPr>
       <w:r>
-        <w:rPr>
-          <w:iCs/>
-          <w:i/>
-        </w:rPr>
-        <w:t xml:space="preserve">Tao Te Ching</w:t>
-      </w:r>
-      <w:r>
-        <w:t xml:space="preserve">, ch. 15, the muddy water (Chapter 9).</w:t>
+        <w:t xml:space="preserve">Watts,</w:t>
+      </w:r>
+      <w:r>
+        <w:t xml:space="preserve"> </w:t>
+      </w:r>
+      <w:r>
+        <w:rPr>
+          <w:iCs/>
+          <w:i/>
+        </w:rPr>
+        <w:t xml:space="preserve">The Wisdom of Insecurity</w:t>
+      </w:r>
+      <w:r>
+        <w:t xml:space="preserve">: the law of reversed effort and the security paradox (Chapter 9).</w:t>
       </w:r>
       <w:r>
         <w:t xml:space="preserve"> </w:t>
@@ -22202,7 +22422,7 @@
         <w:t xml:space="preserve"> </w:t>
       </w:r>
       <w:r>
-        <w:t xml:space="preserve">Lau’s wording and page.</w:t>
+        <w:t xml:space="preserve">page numbers.</w:t>
       </w:r>
     </w:p>
     <w:p>
@@ -22214,6 +22434,41 @@
         <w:pStyle w:val="Compact"/>
       </w:pPr>
       <w:r>
+        <w:rPr>
+          <w:iCs/>
+          <w:i/>
+        </w:rPr>
+        <w:t xml:space="preserve">Tao Te Ching</w:t>
+      </w:r>
+      <w:r>
+        <w:t xml:space="preserve">, ch. 15, the muddy water (Chapter 9).</w:t>
+      </w:r>
+      <w:r>
+        <w:t xml:space="preserve"> </w:t>
+      </w:r>
+      <w:r>
+        <w:rPr>
+          <w:iCs/>
+          <w:i/>
+        </w:rPr>
+        <w:t xml:space="preserve">Needed:</w:t>
+      </w:r>
+      <w:r>
+        <w:t xml:space="preserve"> </w:t>
+      </w:r>
+      <w:r>
+        <w:t xml:space="preserve">Lau’s wording and page.</w:t>
+      </w:r>
+    </w:p>
+    <w:p>
+      <w:pPr>
+        <w:numPr>
+          <w:ilvl w:val="0"/>
+          <w:numId w:val="1008"/>
+        </w:numPr>
+        <w:pStyle w:val="Compact"/>
+      </w:pPr>
+      <w:r>
         <w:t xml:space="preserve">Wallace,</w:t>
       </w:r>
       <w:r>
@@ -22249,8 +22504,8 @@
         <w:t xml:space="preserve">page reference.</w:t>
       </w:r>
     </w:p>
-    <w:bookmarkEnd w:id="203"/>
-    <w:bookmarkStart w:id="204" w:name="a-quotation-that-does-not-exist"/>
+    <w:bookmarkEnd w:id="205"/>
+    <w:bookmarkStart w:id="206" w:name="a-quotation-that-does-not-exist"/>
     <w:p>
       <w:pPr>
         <w:pStyle w:val="Heading2"/>
@@ -22298,8 +22553,8 @@
         <w:t xml:space="preserve">. Its circulating instances (on quotation sites, in blog posts and in a widely shared remark by a popular psychologist) trace back only to secondary and tertiary sources. The nearest genuine passage is CW 9i ¶472, on the trickster, which differs in figure, in kind of relation and in its emphasis on unconsciousness. Chapter 8 tells the story because it is an availability cascade in miniature, and because quietly substituting a better quotation would have hidden a demonstration of the book’s own thesis. Do not use the aphorism.</w:t>
       </w:r>
     </w:p>
-    <w:bookmarkEnd w:id="204"/>
-    <w:bookmarkStart w:id="205" w:name="X0c983f42a99c567fc1ab72c4504e0a07b0b42af"/>
+    <w:bookmarkEnd w:id="206"/>
+    <w:bookmarkStart w:id="207" w:name="X0c983f42a99c567fc1ab72c4504e0a07b0b42af"/>
     <w:p>
       <w:pPr>
         <w:pStyle w:val="Heading2"/>
@@ -22360,8 +22615,8 @@
         <w:t xml:space="preserve">in the Levy edition.</w:t>
       </w:r>
     </w:p>
-    <w:bookmarkEnd w:id="205"/>
-    <w:bookmarkEnd w:id="206"/>
+    <w:bookmarkEnd w:id="207"/>
+    <w:bookmarkEnd w:id="208"/>
     <w:sectPr/>
   </w:body>
 </w:document>

</xml_diff>

<commit_message>
Proposition 5 construct-overlap audit; Chapter 6 trigger/channel paragraph; audit handles surname particles
Co-Authored-By: Claude Sonnet 5.5 <noreply@anthropic.com>
Claude-Session: https://claude.ai/code/session_01JWAnyV9wtVuspHNbCAVQht
</commit_message>
<xml_diff>
--- a/book/output/LP_KDP-Trade_v1.0_Revised-Draft_2026-10-03.docx
+++ b/book/output/LP_KDP-Trade_v1.0_Revised-Draft_2026-10-03.docx
@@ -8758,6 +8758,14 @@
         <w:t xml:space="preserve">The idea has near relatives, and they should be named. Popper (1945/1966) argued that the conspiracy theory of society is what remains when belief in divine agency is secularized: the gods are abandoned and sinister groups take their place. Experiments show that people who lack control are more likely to perceive patterns that are not there, including conspiracies (Whitson &amp; Galinsky, 2008). The proposal here shares their premise that a loss of control invites an invented agent or pattern. It differs by tying the invention to one kind of authority, the anonymous kind, and by saying where theories should and should not cluster, which exposes it to the tests at the end of the chapter.</w:t>
       </w:r>
     </w:p>
+    <w:p>
+      <w:pPr>
+        <w:pStyle w:val="BodyText"/>
+      </w:pPr>
+      <w:r>
+        <w:t xml:space="preserve">Two further literatures bear on the claim, and neither is a rival so much as a neighbor. The first finds that people who attribute agency and intention to inanimate things are more inclined to believe in conspiracies (Douglas et al., 2016). That describes a disposition to see an agent. The proposal here describes a situation that rewards the seeing, and the two can be true together. The second finds conspiracy mentality stronger among voters for opposition parties, those deprived of political control, although the pattern with political orientation persists when that deprivation is adjusted for (Imhoff et al., 2022). The loss of control is a trigger. Where the reach lands is a separate question, and it is the one the anonymity claim answers. Both sets of authors also treat the reach as having a function, and the evolutionary version holds that it detects dangerous coalitions, some of which do exist (van Prooijen &amp; Van Vugt, 2018). The claim of this chapter is narrower: the function that explains the form is the supply of a refusable author.</w:t>
+      </w:r>
+    </w:p>
     <w:bookmarkEnd w:id="99"/>
     <w:bookmarkStart w:id="103" w:name="three-things-the-account-explains"/>
     <w:p>
@@ -15656,7 +15664,7 @@
       </w:r>
     </w:p>
     <w:bookmarkEnd w:id="155"/>
-    <w:bookmarkStart w:id="196" w:name="works-cited"/>
+    <w:bookmarkStart w:id="199" w:name="works-cited"/>
     <w:p>
       <w:pPr>
         <w:pStyle w:val="Heading1"/>
@@ -15952,6 +15960,38 @@
         <w:pStyle w:val="BodyText"/>
       </w:pPr>
       <w:r>
+        <w:t xml:space="preserve">Douglas, K. M., Sutton, R. M., Callan, M. J., Dawtry, R. J., &amp; Harvey, A. J. (2016). Someone is pulling the strings: Hypersensitive agency detection and belief in conspiracy theories.</w:t>
+      </w:r>
+      <w:r>
+        <w:t xml:space="preserve"> </w:t>
+      </w:r>
+      <w:r>
+        <w:rPr>
+          <w:iCs/>
+          <w:i/>
+        </w:rPr>
+        <w:t xml:space="preserve">Thinking &amp; Reasoning, 22</w:t>
+      </w:r>
+      <w:r>
+        <w:t xml:space="preserve">(1), 57–77.</w:t>
+      </w:r>
+      <w:r>
+        <w:t xml:space="preserve"> </w:t>
+      </w:r>
+      <w:hyperlink r:id="rId163">
+        <w:r>
+          <w:rPr>
+            <w:rStyle w:val="Hyperlink"/>
+          </w:rPr>
+          <w:t xml:space="preserve">https://doi.org/10.1080/13546783.2015.1051586</w:t>
+        </w:r>
+      </w:hyperlink>
+    </w:p>
+    <w:p>
+      <w:pPr>
+        <w:pStyle w:val="BodyText"/>
+      </w:pPr>
+      <w:r>
         <w:t xml:space="preserve">Douglas, K. M., Sutton, R. M., &amp; Cichocka, A. (2017). The psychology of conspiracy theories.</w:t>
       </w:r>
       <w:r>
@@ -15970,7 +16010,7 @@
       <w:r>
         <w:t xml:space="preserve"> </w:t>
       </w:r>
-      <w:hyperlink r:id="rId163">
+      <w:hyperlink r:id="rId164">
         <w:r>
           <w:rPr>
             <w:rStyle w:val="Hyperlink"/>
@@ -16002,7 +16042,7 @@
       <w:r>
         <w:t xml:space="preserve"> </w:t>
       </w:r>
-      <w:hyperlink r:id="rId164">
+      <w:hyperlink r:id="rId165">
         <w:r>
           <w:rPr>
             <w:rStyle w:val="Hyperlink"/>
@@ -16034,7 +16074,7 @@
       <w:r>
         <w:t xml:space="preserve"> </w:t>
       </w:r>
-      <w:hyperlink r:id="rId165">
+      <w:hyperlink r:id="rId166">
         <w:r>
           <w:rPr>
             <w:rStyle w:val="Hyperlink"/>
@@ -16087,7 +16127,7 @@
       <w:r>
         <w:t xml:space="preserve"> </w:t>
       </w:r>
-      <w:hyperlink r:id="rId166">
+      <w:hyperlink r:id="rId167">
         <w:r>
           <w:rPr>
             <w:rStyle w:val="Hyperlink"/>
@@ -16248,7 +16288,7 @@
       <w:r>
         <w:t xml:space="preserve"> </w:t>
       </w:r>
-      <w:hyperlink r:id="rId167">
+      <w:hyperlink r:id="rId168">
         <w:r>
           <w:rPr>
             <w:rStyle w:val="Hyperlink"/>
@@ -16280,7 +16320,7 @@
       <w:r>
         <w:t xml:space="preserve"> </w:t>
       </w:r>
-      <w:hyperlink r:id="rId168">
+      <w:hyperlink r:id="rId169">
         <w:r>
           <w:rPr>
             <w:rStyle w:val="Hyperlink"/>
@@ -16312,7 +16352,7 @@
       <w:r>
         <w:t xml:space="preserve"> </w:t>
       </w:r>
-      <w:hyperlink r:id="rId169">
+      <w:hyperlink r:id="rId170">
         <w:r>
           <w:rPr>
             <w:rStyle w:val="Hyperlink"/>
@@ -16368,7 +16408,7 @@
       <w:r>
         <w:t xml:space="preserve"> </w:t>
       </w:r>
-      <w:hyperlink r:id="rId170">
+      <w:hyperlink r:id="rId171">
         <w:r>
           <w:rPr>
             <w:rStyle w:val="Hyperlink"/>
@@ -16382,6 +16422,38 @@
         <w:pStyle w:val="BodyText"/>
       </w:pPr>
       <w:r>
+        <w:t xml:space="preserve">Imhoff, R., Zimmer, F., Klein, O., António, J. H. C., Babinska, M., Bangerter, A., Bilewicz, M., Blanuša, N., Bovan, K., Bužarovska, R., Cichocka, A., Delouvée, S., Douglas, K. M., Dyrendal, A., Etienne, T., Gjoneska, B., Graf, S., Gualda, E., Hirschberger, G., . . . van Prooijen, J.-W. (2022). Conspiracy mentality and political orientation across 26 countries.</w:t>
+      </w:r>
+      <w:r>
+        <w:t xml:space="preserve"> </w:t>
+      </w:r>
+      <w:r>
+        <w:rPr>
+          <w:iCs/>
+          <w:i/>
+        </w:rPr>
+        <w:t xml:space="preserve">Nature Human Behaviour, 6</w:t>
+      </w:r>
+      <w:r>
+        <w:t xml:space="preserve">(3), 392–403.</w:t>
+      </w:r>
+      <w:r>
+        <w:t xml:space="preserve"> </w:t>
+      </w:r>
+      <w:hyperlink r:id="rId172">
+        <w:r>
+          <w:rPr>
+            <w:rStyle w:val="Hyperlink"/>
+          </w:rPr>
+          <w:t xml:space="preserve">https://doi.org/10.1038/s41562-021-01258-7</w:t>
+        </w:r>
+      </w:hyperlink>
+    </w:p>
+    <w:p>
+      <w:pPr>
+        <w:pStyle w:val="BodyText"/>
+      </w:pPr>
+      <w:r>
         <w:t xml:space="preserve">Iyengar, S., Lelkes, Y., Levendusky, M., Malhotra, N., &amp; Westwood, S. J. (2019). The origins and consequences of affective polarization in the United States.</w:t>
       </w:r>
       <w:r>
@@ -16400,7 +16472,7 @@
       <w:r>
         <w:t xml:space="preserve"> </w:t>
       </w:r>
-      <w:hyperlink r:id="rId171">
+      <w:hyperlink r:id="rId173">
         <w:r>
           <w:rPr>
             <w:rStyle w:val="Hyperlink"/>
@@ -16474,7 +16546,7 @@
       <w:r>
         <w:t xml:space="preserve"> </w:t>
       </w:r>
-      <w:hyperlink r:id="rId172">
+      <w:hyperlink r:id="rId174">
         <w:r>
           <w:rPr>
             <w:rStyle w:val="Hyperlink"/>
@@ -16602,7 +16674,7 @@
       <w:r>
         <w:t xml:space="preserve"> </w:t>
       </w:r>
-      <w:hyperlink r:id="rId173">
+      <w:hyperlink r:id="rId175">
         <w:r>
           <w:rPr>
             <w:rStyle w:val="Hyperlink"/>
@@ -16637,7 +16709,7 @@
       <w:r>
         <w:t xml:space="preserve"> </w:t>
       </w:r>
-      <w:hyperlink r:id="rId174">
+      <w:hyperlink r:id="rId176">
         <w:r>
           <w:rPr>
             <w:rStyle w:val="Hyperlink"/>
@@ -16693,7 +16765,7 @@
       <w:r>
         <w:t xml:space="preserve"> </w:t>
       </w:r>
-      <w:hyperlink r:id="rId175">
+      <w:hyperlink r:id="rId177">
         <w:r>
           <w:rPr>
             <w:rStyle w:val="Hyperlink"/>
@@ -16725,7 +16797,7 @@
       <w:r>
         <w:t xml:space="preserve"> </w:t>
       </w:r>
-      <w:hyperlink r:id="rId176">
+      <w:hyperlink r:id="rId178">
         <w:r>
           <w:rPr>
             <w:rStyle w:val="Hyperlink"/>
@@ -16781,7 +16853,7 @@
       <w:r>
         <w:t xml:space="preserve"> </w:t>
       </w:r>
-      <w:hyperlink r:id="rId177">
+      <w:hyperlink r:id="rId179">
         <w:r>
           <w:rPr>
             <w:rStyle w:val="Hyperlink"/>
@@ -16834,7 +16906,7 @@
       <w:r>
         <w:t xml:space="preserve"> </w:t>
       </w:r>
-      <w:hyperlink r:id="rId178">
+      <w:hyperlink r:id="rId180">
         <w:r>
           <w:rPr>
             <w:rStyle w:val="Hyperlink"/>
@@ -16866,7 +16938,7 @@
       <w:r>
         <w:t xml:space="preserve"> </w:t>
       </w:r>
-      <w:hyperlink r:id="rId179">
+      <w:hyperlink r:id="rId181">
         <w:r>
           <w:rPr>
             <w:rStyle w:val="Hyperlink"/>
@@ -16925,7 +16997,7 @@
       <w:r>
         <w:t xml:space="preserve"> </w:t>
       </w:r>
-      <w:hyperlink r:id="rId180">
+      <w:hyperlink r:id="rId182">
         <w:r>
           <w:rPr>
             <w:rStyle w:val="Hyperlink"/>
@@ -16966,7 +17038,7 @@
       <w:r>
         <w:t xml:space="preserve"> </w:t>
       </w:r>
-      <w:hyperlink r:id="rId181">
+      <w:hyperlink r:id="rId183">
         <w:r>
           <w:rPr>
             <w:rStyle w:val="Hyperlink"/>
@@ -17007,7 +17079,7 @@
       <w:r>
         <w:t xml:space="preserve"> </w:t>
       </w:r>
-      <w:hyperlink r:id="rId182">
+      <w:hyperlink r:id="rId184">
         <w:r>
           <w:rPr>
             <w:rStyle w:val="Hyperlink"/>
@@ -17048,7 +17120,7 @@
       <w:r>
         <w:t xml:space="preserve"> </w:t>
       </w:r>
-      <w:hyperlink r:id="rId183">
+      <w:hyperlink r:id="rId185">
         <w:r>
           <w:rPr>
             <w:rStyle w:val="Hyperlink"/>
@@ -17089,7 +17161,7 @@
       <w:r>
         <w:t xml:space="preserve"> </w:t>
       </w:r>
-      <w:hyperlink r:id="rId184">
+      <w:hyperlink r:id="rId186">
         <w:r>
           <w:rPr>
             <w:rStyle w:val="Hyperlink"/>
@@ -17127,7 +17199,7 @@
       <w:r>
         <w:t xml:space="preserve"> </w:t>
       </w:r>
-      <w:hyperlink r:id="rId185">
+      <w:hyperlink r:id="rId187">
         <w:r>
           <w:rPr>
             <w:rStyle w:val="Hyperlink"/>
@@ -17207,7 +17279,7 @@
       <w:r>
         <w:t xml:space="preserve"> </w:t>
       </w:r>
-      <w:hyperlink r:id="rId186">
+      <w:hyperlink r:id="rId188">
         <w:r>
           <w:rPr>
             <w:rStyle w:val="Hyperlink"/>
@@ -17239,7 +17311,7 @@
       <w:r>
         <w:t xml:space="preserve"> </w:t>
       </w:r>
-      <w:hyperlink r:id="rId187">
+      <w:hyperlink r:id="rId189">
         <w:r>
           <w:rPr>
             <w:rStyle w:val="Hyperlink"/>
@@ -17286,7 +17358,7 @@
       <w:r>
         <w:t xml:space="preserve"> </w:t>
       </w:r>
-      <w:hyperlink r:id="rId188">
+      <w:hyperlink r:id="rId190">
         <w:r>
           <w:rPr>
             <w:rStyle w:val="Hyperlink"/>
@@ -17318,7 +17390,7 @@
       <w:r>
         <w:t xml:space="preserve"> </w:t>
       </w:r>
-      <w:hyperlink r:id="rId189">
+      <w:hyperlink r:id="rId191">
         <w:r>
           <w:rPr>
             <w:rStyle w:val="Hyperlink"/>
@@ -17353,7 +17425,7 @@
       <w:r>
         <w:t xml:space="preserve"> </w:t>
       </w:r>
-      <w:hyperlink r:id="rId190">
+      <w:hyperlink r:id="rId192">
         <w:r>
           <w:rPr>
             <w:rStyle w:val="Hyperlink"/>
@@ -17391,7 +17463,7 @@
       <w:r>
         <w:t xml:space="preserve"> </w:t>
       </w:r>
-      <w:hyperlink r:id="rId191">
+      <w:hyperlink r:id="rId193">
         <w:r>
           <w:rPr>
             <w:rStyle w:val="Hyperlink"/>
@@ -17489,6 +17561,38 @@
         <w:pStyle w:val="BodyText"/>
       </w:pPr>
       <w:r>
+        <w:t xml:space="preserve">van Prooijen, J.-W., &amp; Van Vugt, M. (2018). Conspiracy theories: Evolved functions and psychological mechanisms.</w:t>
+      </w:r>
+      <w:r>
+        <w:t xml:space="preserve"> </w:t>
+      </w:r>
+      <w:r>
+        <w:rPr>
+          <w:iCs/>
+          <w:i/>
+        </w:rPr>
+        <w:t xml:space="preserve">Perspectives on Psychological Science, 13</w:t>
+      </w:r>
+      <w:r>
+        <w:t xml:space="preserve">(6), 770–788.</w:t>
+      </w:r>
+      <w:r>
+        <w:t xml:space="preserve"> </w:t>
+      </w:r>
+      <w:hyperlink r:id="rId194">
+        <w:r>
+          <w:rPr>
+            <w:rStyle w:val="Hyperlink"/>
+          </w:rPr>
+          <w:t xml:space="preserve">https://doi.org/10.1177/1745691618774270</w:t>
+        </w:r>
+      </w:hyperlink>
+    </w:p>
+    <w:p>
+      <w:pPr>
+        <w:pStyle w:val="BodyText"/>
+      </w:pPr>
+      <w:r>
         <w:t xml:space="preserve">Watts, A. (1966).</w:t>
       </w:r>
       <w:r>
@@ -17528,7 +17632,7 @@
       <w:r>
         <w:t xml:space="preserve"> </w:t>
       </w:r>
-      <w:hyperlink r:id="rId192">
+      <w:hyperlink r:id="rId195">
         <w:r>
           <w:rPr>
             <w:rStyle w:val="Hyperlink"/>
@@ -17581,7 +17685,7 @@
       <w:r>
         <w:t xml:space="preserve"> </w:t>
       </w:r>
-      <w:hyperlink r:id="rId193">
+      <w:hyperlink r:id="rId196">
         <w:r>
           <w:rPr>
             <w:rStyle w:val="Hyperlink"/>
@@ -17613,7 +17717,7 @@
       <w:r>
         <w:t xml:space="preserve"> </w:t>
       </w:r>
-      <w:hyperlink r:id="rId194">
+      <w:hyperlink r:id="rId197">
         <w:r>
           <w:rPr>
             <w:rStyle w:val="Hyperlink"/>
@@ -17645,7 +17749,7 @@
       <w:r>
         <w:t xml:space="preserve"> </w:t>
       </w:r>
-      <w:hyperlink r:id="rId195">
+      <w:hyperlink r:id="rId198">
         <w:r>
           <w:rPr>
             <w:rStyle w:val="Hyperlink"/>
@@ -17654,8 +17758,8 @@
         </w:r>
       </w:hyperlink>
     </w:p>
-    <w:bookmarkEnd w:id="196"/>
-    <w:bookmarkStart w:id="197" w:name="app-a"/>
+    <w:bookmarkEnd w:id="199"/>
+    <w:bookmarkStart w:id="200" w:name="app-a"/>
     <w:p>
       <w:pPr>
         <w:pStyle w:val="Heading1"/>
@@ -18175,8 +18279,8 @@
         <w:t xml:space="preserve">principle to Samuel Johnson, a claim this edition could not support. Neither claim appears in the book.</w:t>
       </w:r>
     </w:p>
-    <w:bookmarkEnd w:id="197"/>
-    <w:bookmarkStart w:id="198" w:name="app-b"/>
+    <w:bookmarkEnd w:id="200"/>
+    <w:bookmarkStart w:id="201" w:name="app-b"/>
     <w:p>
       <w:pPr>
         <w:pStyle w:val="Heading1"/>
@@ -19210,8 +19314,8 @@
         </w:tc>
       </w:tr>
     </w:tbl>
-    <w:bookmarkEnd w:id="198"/>
-    <w:bookmarkStart w:id="199" w:name="app-c"/>
+    <w:bookmarkEnd w:id="201"/>
+    <w:bookmarkStart w:id="202" w:name="app-c"/>
     <w:p>
       <w:pPr>
         <w:pStyle w:val="Heading1"/>
@@ -21100,8 +21204,8 @@
         </w:tc>
       </w:tr>
     </w:tbl>
-    <w:bookmarkEnd w:id="199"/>
-    <w:bookmarkStart w:id="202" w:name="app-d"/>
+    <w:bookmarkEnd w:id="202"/>
+    <w:bookmarkStart w:id="205" w:name="app-d"/>
     <w:p>
       <w:pPr>
         <w:pStyle w:val="Heading1"/>
@@ -21110,7 +21214,7 @@
         <w:t xml:space="preserve">Appendix D: Limits of the Argument, and the Tests That Would Show It Wrong</w:t>
       </w:r>
     </w:p>
-    <w:bookmarkStart w:id="200" w:name="standing-limits"/>
+    <w:bookmarkStart w:id="203" w:name="standing-limits"/>
     <w:p>
       <w:pPr>
         <w:pStyle w:val="Heading2"/>
@@ -21227,8 +21331,8 @@
         <w:t xml:space="preserve">(an interested arranger, and friction removed for each individual) may do less work than the argument needs. Proposition 8 couples components that each have evidence, but the coupling itself is inferred. Proposition 10 claims a shared ingredient and a common family of capacities; the research on distress tolerance supports the family and leaves open whether practice transfers between its members. The norm-seeding argument of Chapter 9 depends on a historical record of norm entrepreneurship whose successes may be selected on the outcome. The claim that civil conflict is the one threat within a citizen’s reach rests on attitude experiments (Voelkel et al., 2024), not on long-run data about conduct. The datum of Chapter 7, that near-universal assent has changed almost nothing, rests on one measured case (teen self-reports in Faverio and Sidoti, 2024) and on assent among adults that is observed informally and not measured here.</w:t>
       </w:r>
     </w:p>
-    <w:bookmarkEnd w:id="200"/>
-    <w:bookmarkStart w:id="201" w:name="tests-by-proposition"/>
+    <w:bookmarkEnd w:id="203"/>
+    <w:bookmarkStart w:id="204" w:name="tests-by-proposition"/>
     <w:p>
       <w:pPr>
         <w:pStyle w:val="Heading2"/>
@@ -21875,9 +21979,9 @@
         <w:t xml:space="preserve">to unpack it into a decision. The proposition predicts near-universal failure, including among professional critics.</w:t>
       </w:r>
     </w:p>
-    <w:bookmarkEnd w:id="201"/>
-    <w:bookmarkEnd w:id="202"/>
-    <w:bookmarkStart w:id="208" w:name="app-e"/>
+    <w:bookmarkEnd w:id="204"/>
+    <w:bookmarkEnd w:id="205"/>
+    <w:bookmarkStart w:id="211" w:name="app-e"/>
     <w:p>
       <w:pPr>
         <w:pStyle w:val="Heading1"/>
@@ -21886,7 +21990,7 @@
         <w:t xml:space="preserve">Appendix E: Note on Quotation and Sources</w:t>
       </w:r>
     </w:p>
-    <w:bookmarkStart w:id="203" w:name="the-marks"/>
+    <w:bookmarkStart w:id="206" w:name="the-marks"/>
     <w:p>
       <w:pPr>
         <w:pStyle w:val="Heading2"/>
@@ -21979,8 +22083,8 @@
         <w:t xml:space="preserve">to Paul V. Cohn. The title page of the transcribed edition gives Thomas Common as translator, with Cohn and Maude Petre rendering the poetry. The Works Cited follows the title page. The constitutional phrases in Chapter 2 are from the Bill of Rights. The modular edition’s edition-of-record decision (Cambridge Texts for Nietzsche) still governs paraphrase. Public-domain translations are used for verbatim quotation because they could be verified and they raise no permissions question for a self-published book.</w:t>
       </w:r>
     </w:p>
-    <w:bookmarkEnd w:id="203"/>
-    <w:bookmarkStart w:id="204" w:name="unverified-items"/>
+    <w:bookmarkEnd w:id="206"/>
+    <w:bookmarkStart w:id="207" w:name="unverified-items"/>
     <w:p>
       <w:pPr>
         <w:pStyle w:val="Heading2"/>
@@ -22262,8 +22366,8 @@
         <w:t xml:space="preserve">a NASA or Congressional primary document.</w:t>
       </w:r>
     </w:p>
-    <w:bookmarkEnd w:id="204"/>
-    <w:bookmarkStart w:id="205" w:name="paraphrases-awaiting-verbatim-wording"/>
+    <w:bookmarkEnd w:id="207"/>
+    <w:bookmarkStart w:id="208" w:name="paraphrases-awaiting-verbatim-wording"/>
     <w:p>
       <w:pPr>
         <w:pStyle w:val="Heading2"/>
@@ -22504,8 +22608,8 @@
         <w:t xml:space="preserve">page reference.</w:t>
       </w:r>
     </w:p>
-    <w:bookmarkEnd w:id="205"/>
-    <w:bookmarkStart w:id="206" w:name="a-quotation-that-does-not-exist"/>
+    <w:bookmarkEnd w:id="208"/>
+    <w:bookmarkStart w:id="209" w:name="a-quotation-that-does-not-exist"/>
     <w:p>
       <w:pPr>
         <w:pStyle w:val="Heading2"/>
@@ -22553,8 +22657,8 @@
         <w:t xml:space="preserve">. Its circulating instances (on quotation sites, in blog posts and in a widely shared remark by a popular psychologist) trace back only to secondary and tertiary sources. The nearest genuine passage is CW 9i ¶472, on the trickster, which differs in figure, in kind of relation and in its emphasis on unconsciousness. Chapter 8 tells the story because it is an availability cascade in miniature, and because quietly substituting a better quotation would have hidden a demonstration of the book’s own thesis. Do not use the aphorism.</w:t>
       </w:r>
     </w:p>
-    <w:bookmarkEnd w:id="206"/>
-    <w:bookmarkStart w:id="207" w:name="X0c983f42a99c567fc1ab72c4504e0a07b0b42af"/>
+    <w:bookmarkEnd w:id="209"/>
+    <w:bookmarkStart w:id="210" w:name="X0c983f42a99c567fc1ab72c4504e0a07b0b42af"/>
     <w:p>
       <w:pPr>
         <w:pStyle w:val="Heading2"/>
@@ -22615,8 +22719,8 @@
         <w:t xml:space="preserve">in the Levy edition.</w:t>
       </w:r>
     </w:p>
-    <w:bookmarkEnd w:id="207"/>
-    <w:bookmarkEnd w:id="208"/>
+    <w:bookmarkEnd w:id="210"/>
+    <w:bookmarkEnd w:id="211"/>
     <w:sectPr/>
   </w:body>
 </w:document>

</xml_diff>